<commit_message>
Refactor Thesis Entry Form and Improve User Experience
- Updated the ThesisEntryForm.html to enhance accessibility and user interaction.
- Added error handling for missing date and stock information in the thesis submission process.
- Improved the contrast of placeholder text in input fields for better readability.
- Enhanced the data disclaimer overlay with improved styling and accessibility features.
- Made aesthetic optimizations based on user feedback, including adjustments to font sizes and button placements.
- Updated the Testing table to reflect new validation checks and their benefits to user experience.
- Added a new Worklog document to track project progress.
- Refined CSS styles for better visual consistency and responsiveness across devices.
</commit_message>
<xml_diff>
--- a/Project Breif.docx
+++ b/Project Breif.docx
@@ -1,6 +1,6 @@
 
 <file path=word/document.xml><?xml version="1.0" encoding="utf-8"?>
-<w:document xmlns:wpc="http://schemas.microsoft.com/office/word/2010/wordprocessingCanvas" xmlns:cx="http://schemas.microsoft.com/office/drawing/2014/chartex" xmlns:cx1="http://schemas.microsoft.com/office/drawing/2015/9/8/chartex" xmlns:cx2="http://schemas.microsoft.com/office/drawing/2015/10/21/chartex" xmlns:cx3="http://schemas.microsoft.com/office/drawing/2016/5/9/chartex" xmlns:cx4="http://schemas.microsoft.com/office/drawing/2016/5/10/chartex" xmlns:cx5="http://schemas.microsoft.com/office/drawing/2016/5/11/chartex" xmlns:cx6="http://schemas.microsoft.com/office/drawing/2016/5/12/chartex" xmlns:cx7="http://schemas.microsoft.com/office/drawing/2016/5/13/chartex" xmlns:cx8="http://schemas.microsoft.com/office/drawing/2016/5/14/chartex" xmlns:mc="http://schemas.openxmlformats.org/markup-compatibility/2006" xmlns:aink="http://schemas.microsoft.com/office/drawing/2016/ink" xmlns:am3d="http://schemas.microsoft.com/office/drawing/2017/model3d" xmlns:o="urn:schemas-microsoft-com:office:office" xmlns:oel="http://schemas.microsoft.com/office/2019/extlst" xmlns:r="http://schemas.openxmlformats.org/officeDocument/2006/relationships" xmlns:m="http://schemas.openxmlformats.org/officeDocument/2006/math" xmlns:v="urn:schemas-microsoft-com:vml" xmlns:wp14="http://schemas.microsoft.com/office/word/2010/wordprocessingDrawing" xmlns:wp="http://schemas.openxmlformats.org/drawingml/2006/wordprocessingDrawing" xmlns:w10="urn:schemas-microsoft-com:office:word" xmlns:w="http://schemas.openxmlformats.org/wordprocessingml/2006/main" xmlns:w14="http://schemas.microsoft.com/office/word/2010/wordml" xmlns:w15="http://schemas.microsoft.com/office/word/2012/wordml" xmlns:w16cex="http://schemas.microsoft.com/office/word/2018/wordml/cex" xmlns:w16cid="http://schemas.microsoft.com/office/word/2016/wordml/cid" xmlns:w16="http://schemas.microsoft.com/office/word/2018/wordml" xmlns:w16du="http://schemas.microsoft.com/office/word/2023/wordml/word16du" xmlns:w16sdtdh="http://schemas.microsoft.com/office/word/2020/wordml/sdtdatahash" xmlns:w16sdtfl="http://schemas.microsoft.com/office/word/2024/wordml/sdtformatlock" xmlns:w16se="http://schemas.microsoft.com/office/word/2015/wordml/symex" xmlns:wpg="http://schemas.microsoft.com/office/word/2010/wordprocessingGroup" xmlns:wpi="http://schemas.microsoft.com/office/word/2010/wordprocessingInk" xmlns:wne="http://schemas.microsoft.com/office/word/2006/wordml" xmlns:wps="http://schemas.microsoft.com/office/word/2010/wordprocessingShape" mc:Ignorable="w14 w15 w16se w16cid w16 w16cex w16sdtdh w16sdtfl w16du wp14">
+<w:document xmlns:wpc="http://schemas.microsoft.com/office/word/2010/wordprocessingCanvas" xmlns:cx="http://schemas.microsoft.com/office/drawing/2014/chartex" xmlns:cx1="http://schemas.microsoft.com/office/drawing/2015/9/8/chartex" xmlns:cx2="http://schemas.microsoft.com/office/drawing/2015/10/21/chartex" xmlns:cx3="http://schemas.microsoft.com/office/drawing/2016/5/9/chartex" xmlns:cx4="http://schemas.microsoft.com/office/drawing/2016/5/10/chartex" xmlns:cx5="http://schemas.microsoft.com/office/drawing/2016/5/11/chartex" xmlns:cx6="http://schemas.microsoft.com/office/drawing/2016/5/12/chartex" xmlns:cx7="http://schemas.microsoft.com/office/drawing/2016/5/13/chartex" xmlns:cx8="http://schemas.microsoft.com/office/drawing/2016/5/14/chartex" xmlns:mc="http://schemas.openxmlformats.org/markup-compatibility/2006" xmlns:aink="http://schemas.microsoft.com/office/drawing/2016/ink" xmlns:am3d="http://schemas.microsoft.com/office/drawing/2017/model3d" xmlns:o="urn:schemas-microsoft-com:office:office" xmlns:oel="http://schemas.microsoft.com/office/2019/extlst" xmlns:r="http://schemas.openxmlformats.org/officeDocument/2006/relationships" xmlns:m="http://schemas.openxmlformats.org/officeDocument/2006/math" xmlns:v="urn:schemas-microsoft-com:vml" xmlns:wp14="http://schemas.microsoft.com/office/word/2010/wordprocessingDrawing" xmlns:wp="http://schemas.openxmlformats.org/drawingml/2006/wordprocessingDrawing" xmlns:w10="urn:schemas-microsoft-com:office:word" xmlns:w="http://schemas.openxmlformats.org/wordprocessingml/2006/main" xmlns:w14="http://schemas.microsoft.com/office/word/2010/wordml" xmlns:w15="http://schemas.microsoft.com/office/word/2012/wordml" xmlns:w16cei="http://schemas.microsoft.com/office/word/2026/wordml/cei" xmlns:w16cex="http://schemas.microsoft.com/office/word/2018/wordml/cex" xmlns:w16cid="http://schemas.microsoft.com/office/word/2016/wordml/cid" xmlns:w16="http://schemas.microsoft.com/office/word/2018/wordml" xmlns:w16du="http://schemas.microsoft.com/office/word/2023/wordml/word16du" xmlns:w16sdtdh="http://schemas.microsoft.com/office/word/2020/wordml/sdtdatahash" xmlns:w16sdtfl="http://schemas.microsoft.com/office/word/2024/wordml/sdtformatlock" xmlns:w16se="http://schemas.microsoft.com/office/word/2015/wordml/symex" xmlns:wpg="http://schemas.microsoft.com/office/word/2010/wordprocessingGroup" xmlns:wpi="http://schemas.microsoft.com/office/word/2010/wordprocessingInk" xmlns:wne="http://schemas.microsoft.com/office/word/2006/wordml" xmlns:wps="http://schemas.microsoft.com/office/word/2010/wordprocessingShape" mc:Ignorable="w14 w15 w16se w16cid w16 w16cex w16sdtdh w16sdtfl w16du wp14">
   <w:body>
     <w:p>
       <w:pPr>
@@ -548,7 +548,7 @@
           <w:noProof/>
         </w:rPr>
         <w:drawing>
-          <wp:anchor distT="0" distB="0" distL="114300" distR="114300" simplePos="0" relativeHeight="251659264" behindDoc="0" locked="0" layoutInCell="1" allowOverlap="1" wp14:anchorId="6784BBF7" wp14:editId="759B3BC7">
+          <wp:anchor distT="0" distB="0" distL="114300" distR="114300" simplePos="0" relativeHeight="251659264" behindDoc="0" locked="0" layoutInCell="1" allowOverlap="1" wp14:anchorId="6784BBF7" wp14:editId="5E2851D4">
             <wp:simplePos x="0" y="0"/>
             <wp:positionH relativeFrom="margin">
               <wp:align>right</wp:align>
@@ -608,7 +608,7 @@
           <w:noProof/>
         </w:rPr>
         <w:drawing>
-          <wp:anchor distT="0" distB="0" distL="114300" distR="114300" simplePos="0" relativeHeight="251660288" behindDoc="0" locked="0" layoutInCell="1" allowOverlap="1" wp14:anchorId="5A2686F4" wp14:editId="2977D7B6">
+          <wp:anchor distT="0" distB="0" distL="114300" distR="114300" simplePos="0" relativeHeight="251660288" behindDoc="0" locked="0" layoutInCell="1" allowOverlap="1" wp14:anchorId="5A2686F4" wp14:editId="3C532E69">
             <wp:simplePos x="0" y="0"/>
             <wp:positionH relativeFrom="column">
               <wp:posOffset>-672948</wp:posOffset>
@@ -733,12 +733,21 @@
         </w:rPr>
       </w:pPr>
       <w:hyperlink r:id="rId10" w:history="1">
+        <w:proofErr w:type="spellStart"/>
         <w:r>
           <w:rPr>
             <w:rStyle w:val="Hyperlink"/>
             <w:lang w:val="fr-FR"/>
           </w:rPr>
-          <w:t>Create a Palette - Coolors</w:t>
+          <w:t>Create</w:t>
+        </w:r>
+        <w:proofErr w:type="spellEnd"/>
+        <w:r>
+          <w:rPr>
+            <w:rStyle w:val="Hyperlink"/>
+            <w:lang w:val="fr-FR"/>
+          </w:rPr>
+          <w:t xml:space="preserve"> a Palette - Coolors</w:t>
         </w:r>
       </w:hyperlink>
       <w:r>
@@ -2511,6 +2520,44 @@
     </w:p>
     <w:p>
       <w:pPr>
+        <w:pStyle w:val="Heading2"/>
+        <w:rPr>
+          <w:color w:val="000000" w:themeColor="text1"/>
+        </w:rPr>
+      </w:pPr>
+      <w:bookmarkStart w:id="0" w:name="_Aesthetic_optimizations_to"/>
+      <w:bookmarkEnd w:id="0"/>
+      <w:r>
+        <w:rPr>
+          <w:color w:val="000000" w:themeColor="text1"/>
+          <w:highlight w:val="yellow"/>
+        </w:rPr>
+        <w:t>Aesthetic optimizations to meet my relevant implications:</w:t>
+      </w:r>
+      <w:r>
+        <w:rPr>
+          <w:color w:val="000000" w:themeColor="text1"/>
+        </w:rPr>
+        <w:t xml:space="preserve"> </w:t>
+      </w:r>
+      <w:r>
+        <w:rPr>
+          <w:color w:val="000000" w:themeColor="text1"/>
+        </w:rPr>
+        <w:t xml:space="preserve"> - add to testing log.</w:t>
+      </w:r>
+    </w:p>
+    <w:p>
+      <w:pPr>
+        <w:pStyle w:val="ListParagraph"/>
+        <w:numPr>
+          <w:ilvl w:val="0"/>
+          <w:numId w:val="9"/>
+        </w:numPr>
+      </w:pPr>
+    </w:p>
+    <w:p>
+      <w:pPr>
         <w:rPr>
           <w:b/>
           <w:bCs/>
@@ -2519,40 +2566,7 @@
       </w:pPr>
       <w:r>
         <w:rPr>
-          <w:b/>
-          <w:bCs/>
-          <w:highlight w:val="yellow"/>
-          <w:u w:val="single"/>
-        </w:rPr>
-        <w:t>Aesthetic optimizations to meet my relevant implications:</w:t>
-      </w:r>
-      <w:r>
-        <w:rPr>
-          <w:b/>
-          <w:bCs/>
-          <w:u w:val="single"/>
-        </w:rPr>
-        <w:t xml:space="preserve"> </w:t>
-      </w:r>
-      <w:r>
-        <w:rPr>
-          <w:b/>
-          <w:bCs/>
-          <w:u w:val="single"/>
-        </w:rPr>
-        <w:t xml:space="preserve"> - add to testing log.</w:t>
-      </w:r>
-    </w:p>
-    <w:p>
-      <w:pPr>
-        <w:rPr>
-          <w:b/>
-          <w:bCs/>
-          <w:u w:val="single"/>
-        </w:rPr>
-      </w:pPr>
-      <w:r>
-        <w:rPr>
+          <w:noProof/>
           <w:u w:val="single"/>
         </w:rPr>
         <w:drawing>
@@ -2609,6 +2623,7 @@
         <w:rPr>
           <w:b/>
           <w:bCs/>
+          <w:noProof/>
           <w:u w:val="single"/>
         </w:rPr>
         <w:drawing>
@@ -2706,10 +2721,11 @@
       </w:pPr>
       <w:r>
         <w:rPr>
+          <w:noProof/>
           <w:u w:val="single"/>
         </w:rPr>
         <w:drawing>
-          <wp:anchor distT="0" distB="0" distL="114300" distR="114300" simplePos="0" relativeHeight="251689984" behindDoc="0" locked="0" layoutInCell="1" allowOverlap="1" wp14:anchorId="6EC6F9AB" wp14:editId="244B5F84">
+          <wp:anchor distT="0" distB="0" distL="114300" distR="114300" simplePos="0" relativeHeight="251689984" behindDoc="0" locked="0" layoutInCell="1" allowOverlap="1" wp14:anchorId="6EC6F9AB" wp14:editId="3190D4A7">
             <wp:simplePos x="0" y="0"/>
             <wp:positionH relativeFrom="margin">
               <wp:align>left</wp:align>
@@ -2809,8 +2825,366 @@
     <w:p>
       <w:pPr>
         <w:pStyle w:val="ListParagraph"/>
-        <w:rPr>
-          <w:u w:val="single"/>
+      </w:pPr>
+    </w:p>
+    <w:p>
+      <w:pPr>
+        <w:pStyle w:val="ListParagraph"/>
+        <w:numPr>
+          <w:ilvl w:val="0"/>
+          <w:numId w:val="9"/>
+        </w:numPr>
+      </w:pPr>
+      <w:r>
+        <w:drawing>
+          <wp:anchor distT="0" distB="0" distL="114300" distR="114300" simplePos="0" relativeHeight="251692032" behindDoc="0" locked="0" layoutInCell="1" allowOverlap="1" wp14:anchorId="0F760EFC" wp14:editId="61CAA679">
+            <wp:simplePos x="0" y="0"/>
+            <wp:positionH relativeFrom="column">
+              <wp:posOffset>4254792</wp:posOffset>
+            </wp:positionH>
+            <wp:positionV relativeFrom="paragraph">
+              <wp:posOffset>37611</wp:posOffset>
+            </wp:positionV>
+            <wp:extent cx="1666875" cy="1099185"/>
+            <wp:effectExtent l="0" t="0" r="9525" b="5715"/>
+            <wp:wrapSquare wrapText="bothSides"/>
+            <wp:docPr id="1926183861" name="Picture 1"/>
+            <wp:cNvGraphicFramePr>
+              <a:graphicFrameLocks xmlns:a="http://schemas.openxmlformats.org/drawingml/2006/main" noChangeAspect="1"/>
+            </wp:cNvGraphicFramePr>
+            <a:graphic xmlns:a="http://schemas.openxmlformats.org/drawingml/2006/main">
+              <a:graphicData uri="http://schemas.openxmlformats.org/drawingml/2006/picture">
+                <pic:pic xmlns:pic="http://schemas.openxmlformats.org/drawingml/2006/picture">
+                  <pic:nvPicPr>
+                    <pic:cNvPr id="1926183861" name=""/>
+                    <pic:cNvPicPr/>
+                  </pic:nvPicPr>
+                  <pic:blipFill>
+                    <a:blip r:embed="rId22"/>
+                    <a:stretch>
+                      <a:fillRect/>
+                    </a:stretch>
+                  </pic:blipFill>
+                  <pic:spPr>
+                    <a:xfrm>
+                      <a:off x="0" y="0"/>
+                      <a:ext cx="1666875" cy="1099185"/>
+                    </a:xfrm>
+                    <a:prstGeom prst="rect">
+                      <a:avLst/>
+                    </a:prstGeom>
+                  </pic:spPr>
+                </pic:pic>
+              </a:graphicData>
+            </a:graphic>
+            <wp14:sizeRelH relativeFrom="margin">
+              <wp14:pctWidth>0</wp14:pctWidth>
+            </wp14:sizeRelH>
+            <wp14:sizeRelV relativeFrom="margin">
+              <wp14:pctHeight>0</wp14:pctHeight>
+            </wp14:sizeRelV>
+          </wp:anchor>
+        </w:drawing>
+      </w:r>
+      <w:r>
+        <w:t xml:space="preserve">This is the contrast checker for the place holder text on my input boxes on my </w:t>
+      </w:r>
+      <w:r>
+        <w:t>form. This reads it as having a contrast ratio of 1:1.6, which is terrible. While this text is supposed to be subtle, it would almost be better removing it at this contrast level. To fix this I will change it to something of higher contrast,</w:t>
+      </w:r>
+    </w:p>
+    <w:p>
+      <w:pPr>
+        <w:pStyle w:val="ListParagraph"/>
+      </w:pPr>
+    </w:p>
+    <w:p>
+      <w:pPr>
+        <w:pStyle w:val="ListParagraph"/>
+      </w:pPr>
+      <w:r>
+        <w:t>The issue was my placeholder text was never given a value, so it gets assigned to the browser default, which is this unassuming grey. While this would be okay for other platforms, the contrast is simply not going to work for mine.</w:t>
+      </w:r>
+    </w:p>
+    <w:p>
+      <w:pPr>
+        <w:pStyle w:val="ListParagraph"/>
+      </w:pPr>
+    </w:p>
+    <w:p>
+      <w:pPr>
+        <w:pStyle w:val="ListParagraph"/>
+      </w:pPr>
+      <w:r>
+        <w:t>To fix this I added this code</w:t>
+      </w:r>
+      <w:r>
+        <w:t xml:space="preserve">, which specifically targets the placeholder text of my input boxes for my whole form, rather than before where I was trying to style the </w:t>
+      </w:r>
+      <w:proofErr w:type="spellStart"/>
+      <w:r>
+        <w:t>divs</w:t>
+      </w:r>
+      <w:proofErr w:type="spellEnd"/>
+      <w:r>
+        <w:t xml:space="preserve"> that the </w:t>
+      </w:r>
+      <w:r>
+        <w:t>input boxes were in, and of course this just changes the colour of the text that the user can type.</w:t>
+      </w:r>
+    </w:p>
+    <w:p>
+      <w:pPr>
+        <w:pStyle w:val="ListParagraph"/>
+      </w:pPr>
+    </w:p>
+    <w:p>
+      <w:pPr>
+        <w:pStyle w:val="ListParagraph"/>
+        <w:rPr>
+          <w:u w:val="single"/>
+        </w:rPr>
+      </w:pPr>
+      <w:r>
+        <w:rPr>
+          <w:u w:val="single"/>
+        </w:rPr>
+        <w:drawing>
+          <wp:anchor distT="0" distB="0" distL="114300" distR="114300" simplePos="0" relativeHeight="251694080" behindDoc="0" locked="0" layoutInCell="1" allowOverlap="1" wp14:anchorId="29D4E8FD" wp14:editId="0A442FAD">
+            <wp:simplePos x="0" y="0"/>
+            <wp:positionH relativeFrom="page">
+              <wp:posOffset>3504441</wp:posOffset>
+            </wp:positionH>
+            <wp:positionV relativeFrom="paragraph">
+              <wp:posOffset>92789</wp:posOffset>
+            </wp:positionV>
+            <wp:extent cx="3683635" cy="774700"/>
+            <wp:effectExtent l="0" t="0" r="0" b="6350"/>
+            <wp:wrapSquare wrapText="bothSides"/>
+            <wp:docPr id="1587363535" name="Picture 1"/>
+            <wp:cNvGraphicFramePr>
+              <a:graphicFrameLocks xmlns:a="http://schemas.openxmlformats.org/drawingml/2006/main" noChangeAspect="1"/>
+            </wp:cNvGraphicFramePr>
+            <a:graphic xmlns:a="http://schemas.openxmlformats.org/drawingml/2006/main">
+              <a:graphicData uri="http://schemas.openxmlformats.org/drawingml/2006/picture">
+                <pic:pic xmlns:pic="http://schemas.openxmlformats.org/drawingml/2006/picture">
+                  <pic:nvPicPr>
+                    <pic:cNvPr id="1587363535" name=""/>
+                    <pic:cNvPicPr/>
+                  </pic:nvPicPr>
+                  <pic:blipFill>
+                    <a:blip r:embed="rId23"/>
+                    <a:stretch>
+                      <a:fillRect/>
+                    </a:stretch>
+                  </pic:blipFill>
+                  <pic:spPr>
+                    <a:xfrm>
+                      <a:off x="0" y="0"/>
+                      <a:ext cx="3683635" cy="774700"/>
+                    </a:xfrm>
+                    <a:prstGeom prst="rect">
+                      <a:avLst/>
+                    </a:prstGeom>
+                  </pic:spPr>
+                </pic:pic>
+              </a:graphicData>
+            </a:graphic>
+            <wp14:sizeRelH relativeFrom="margin">
+              <wp14:pctWidth>0</wp14:pctWidth>
+            </wp14:sizeRelH>
+            <wp14:sizeRelV relativeFrom="margin">
+              <wp14:pctHeight>0</wp14:pctHeight>
+            </wp14:sizeRelV>
+          </wp:anchor>
+        </w:drawing>
+      </w:r>
+      <w:r>
+        <w:rPr>
+          <w:u w:val="single"/>
+        </w:rPr>
+        <w:t>input::placeholder,</w:t>
+      </w:r>
+    </w:p>
+    <w:p>
+      <w:pPr>
+        <w:pStyle w:val="ListParagraph"/>
+        <w:rPr>
+          <w:u w:val="single"/>
+        </w:rPr>
+      </w:pPr>
+      <w:proofErr w:type="spellStart"/>
+      <w:r>
+        <w:rPr>
+          <w:u w:val="single"/>
+        </w:rPr>
+        <w:t>textarea</w:t>
+      </w:r>
+      <w:proofErr w:type="spellEnd"/>
+      <w:r>
+        <w:rPr>
+          <w:u w:val="single"/>
+        </w:rPr>
+        <w:t>::placeholder {</w:t>
+      </w:r>
+    </w:p>
+    <w:p>
+      <w:pPr>
+        <w:pStyle w:val="ListParagraph"/>
+        <w:rPr>
+          <w:u w:val="single"/>
+        </w:rPr>
+      </w:pPr>
+      <w:r>
+        <w:rPr>
+          <w:u w:val="single"/>
+        </w:rPr>
+        <w:t xml:space="preserve">    </w:t>
+      </w:r>
+      <w:proofErr w:type="spellStart"/>
+      <w:r>
+        <w:rPr>
+          <w:u w:val="single"/>
+        </w:rPr>
+        <w:t>color</w:t>
+      </w:r>
+      <w:proofErr w:type="spellEnd"/>
+      <w:r>
+        <w:rPr>
+          <w:u w:val="single"/>
+        </w:rPr>
+        <w:t>: #F7EEDC;</w:t>
+      </w:r>
+    </w:p>
+    <w:p>
+      <w:pPr>
+        <w:pStyle w:val="ListParagraph"/>
+        <w:rPr>
+          <w:u w:val="single"/>
+        </w:rPr>
+      </w:pPr>
+      <w:r>
+        <w:rPr>
+          <w:u w:val="single"/>
+        </w:rPr>
+        <w:t>    opacity: 1;</w:t>
+      </w:r>
+    </w:p>
+    <w:p>
+      <w:pPr>
+        <w:pStyle w:val="ListParagraph"/>
+        <w:rPr>
+          <w:u w:val="single"/>
+        </w:rPr>
+      </w:pPr>
+      <w:r>
+        <w:rPr>
+          <w:u w:val="single"/>
+        </w:rPr>
+        <w:t>}</w:t>
+      </w:r>
+    </w:p>
+    <w:p>
+      <w:pPr>
+        <w:pStyle w:val="ListParagraph"/>
+        <w:rPr>
+          <w:u w:val="single"/>
+        </w:rPr>
+      </w:pPr>
+    </w:p>
+    <w:p>
+      <w:pPr>
+        <w:pStyle w:val="ListParagraph"/>
+      </w:pPr>
+      <w:r>
+        <w:t>This gives a contrast of 5.6, while not the best, I actually don’t want it to stound out a huge amount because its only supposed to be subtle.</w:t>
+      </w:r>
+    </w:p>
+    <w:p>
+      <w:pPr>
+        <w:pStyle w:val="ListParagraph"/>
+        <w:rPr>
+          <w:u w:val="single"/>
+        </w:rPr>
+      </w:pPr>
+    </w:p>
+    <w:p>
+      <w:pPr>
+        <w:pStyle w:val="ListParagraph"/>
+        <w:rPr>
+          <w:u w:val="single"/>
+        </w:rPr>
+      </w:pPr>
+    </w:p>
+    <w:p>
+      <w:pPr>
+        <w:pStyle w:val="ListParagraph"/>
+        <w:rPr>
+          <w:b/>
+          <w:bCs/>
+        </w:rPr>
+      </w:pPr>
+    </w:p>
+    <w:p>
+      <w:pPr>
+        <w:pStyle w:val="ListParagraph"/>
+        <w:rPr>
+          <w:b/>
+          <w:bCs/>
+        </w:rPr>
+      </w:pPr>
+    </w:p>
+    <w:p>
+      <w:pPr>
+        <w:pStyle w:val="ListParagraph"/>
+        <w:rPr>
+          <w:b/>
+          <w:bCs/>
+        </w:rPr>
+      </w:pPr>
+    </w:p>
+    <w:p>
+      <w:pPr>
+        <w:pStyle w:val="ListParagraph"/>
+        <w:rPr>
+          <w:b/>
+          <w:bCs/>
+        </w:rPr>
+      </w:pPr>
+    </w:p>
+    <w:p>
+      <w:pPr>
+        <w:pStyle w:val="ListParagraph"/>
+        <w:rPr>
+          <w:b/>
+          <w:bCs/>
+        </w:rPr>
+      </w:pPr>
+    </w:p>
+    <w:p>
+      <w:pPr>
+        <w:pStyle w:val="ListParagraph"/>
+        <w:rPr>
+          <w:b/>
+          <w:bCs/>
+        </w:rPr>
+      </w:pPr>
+    </w:p>
+    <w:p>
+      <w:pPr>
+        <w:pStyle w:val="ListParagraph"/>
+        <w:rPr>
+          <w:b/>
+          <w:bCs/>
+        </w:rPr>
+      </w:pPr>
+    </w:p>
+    <w:p>
+      <w:pPr>
+        <w:pStyle w:val="ListParagraph"/>
+        <w:rPr>
+          <w:b/>
+          <w:bCs/>
         </w:rPr>
       </w:pPr>
       <w:r>
@@ -2819,15 +3193,14 @@
           <w:highlight w:val="yellow"/>
           <w:u w:val="single"/>
         </w:rPr>
-        <w:lastRenderedPageBreak/>
         <w:drawing>
-          <wp:anchor distT="0" distB="0" distL="114300" distR="114300" simplePos="0" relativeHeight="251663360" behindDoc="0" locked="0" layoutInCell="1" allowOverlap="1" wp14:anchorId="6F1703F9" wp14:editId="58E2E055">
+          <wp:anchor distT="0" distB="0" distL="114300" distR="114300" simplePos="0" relativeHeight="251663360" behindDoc="0" locked="0" layoutInCell="1" allowOverlap="1" wp14:anchorId="6F1703F9" wp14:editId="392B05D3">
             <wp:simplePos x="0" y="0"/>
             <wp:positionH relativeFrom="margin">
-              <wp:align>right</wp:align>
+              <wp:posOffset>4105337</wp:posOffset>
             </wp:positionH>
             <wp:positionV relativeFrom="paragraph">
-              <wp:posOffset>7875</wp:posOffset>
+              <wp:posOffset>165819</wp:posOffset>
             </wp:positionV>
             <wp:extent cx="1812290" cy="995680"/>
             <wp:effectExtent l="0" t="0" r="0" b="0"/>
@@ -2844,7 +3217,7 @@
                     <pic:cNvPicPr/>
                   </pic:nvPicPr>
                   <pic:blipFill>
-                    <a:blip r:embed="rId22"/>
+                    <a:blip r:embed="rId24"/>
                     <a:stretch>
                       <a:fillRect/>
                     </a:stretch>
@@ -2873,15 +3246,6 @@
     </w:p>
     <w:p>
       <w:pPr>
-        <w:pStyle w:val="ListParagraph"/>
-        <w:rPr>
-          <w:b/>
-          <w:bCs/>
-        </w:rPr>
-      </w:pPr>
-    </w:p>
-    <w:p>
-      <w:pPr>
         <w:rPr>
           <w:b/>
           <w:bCs/>
@@ -2973,6 +3337,7 @@
     </w:p>
     <w:p>
       <w:r>
+        <w:lastRenderedPageBreak/>
         <w:t>My eye was attracted to the glowing button first on the landing page</w:t>
       </w:r>
       <w:r>
@@ -3045,7 +3410,13 @@
     </w:p>
     <w:p>
       <w:r>
-        <w:t xml:space="preserve">I think the next stop is adding a enter button or making it so you can enter your name by clicking the enter button on your keyboard. </w:t>
+        <w:t>I think the next st</w:t>
+      </w:r>
+      <w:r>
+        <w:t>e</w:t>
+      </w:r>
+      <w:r>
+        <w:t xml:space="preserve">p is adding a enter button or making it so you can enter your name by clicking the enter button on your keyboard. </w:t>
       </w:r>
       <w:r>
         <w:t xml:space="preserve">I also feel that you could make the writing a little bit bigger because there is so much space </w:t>
@@ -3058,6 +3429,26 @@
       </w:r>
     </w:p>
     <w:p/>
+    <w:p>
+      <w:r>
+        <w:t>Changes made based on this feedback:</w:t>
+      </w:r>
+    </w:p>
+    <w:p>
+      <w:pPr>
+        <w:pStyle w:val="ListParagraph"/>
+        <w:numPr>
+          <w:ilvl w:val="0"/>
+          <w:numId w:val="2"/>
+        </w:numPr>
+      </w:pPr>
+      <w:r>
+        <w:t>Removed the name entry input + button because I felt like it didn’t serve a purpo</w:t>
+      </w:r>
+      <w:r>
+        <w:t>se.</w:t>
+      </w:r>
+    </w:p>
     <w:p/>
     <w:p>
       <w:pPr>
@@ -3186,26 +3577,26 @@
     </w:p>
     <w:p>
       <w:r>
+        <w:t xml:space="preserve">Yes as this website is designed towards people who like analysis and investing. </w:t>
+      </w:r>
+    </w:p>
+    <w:p>
+      <w:pPr>
+        <w:rPr>
+          <w:u w:val="single"/>
+        </w:rPr>
+      </w:pPr>
+      <w:r>
+        <w:rPr>
+          <w:highlight w:val="yellow"/>
+          <w:u w:val="single"/>
+        </w:rPr>
+        <w:t>My nextsteps for you:</w:t>
+      </w:r>
+    </w:p>
+    <w:p>
+      <w:r>
         <w:lastRenderedPageBreak/>
-        <w:t xml:space="preserve">Yes as this website is designed towards people who like analysis and investing. </w:t>
-      </w:r>
-    </w:p>
-    <w:p>
-      <w:pPr>
-        <w:rPr>
-          <w:u w:val="single"/>
-        </w:rPr>
-      </w:pPr>
-      <w:r>
-        <w:rPr>
-          <w:highlight w:val="yellow"/>
-          <w:u w:val="single"/>
-        </w:rPr>
-        <w:t>My nextsteps for you:</w:t>
-      </w:r>
-    </w:p>
-    <w:p>
-      <w:r>
         <w:t>Put some more contents on the front of the page.</w:t>
       </w:r>
       <w:r>
@@ -3395,7 +3786,7 @@
                     <pic:cNvPicPr/>
                   </pic:nvPicPr>
                   <pic:blipFill>
-                    <a:blip r:embed="rId23"/>
+                    <a:blip r:embed="rId25"/>
                     <a:stretch>
                       <a:fillRect/>
                     </a:stretch>
@@ -3450,7 +3841,7 @@
                     <pic:cNvPicPr/>
                   </pic:nvPicPr>
                   <pic:blipFill>
-                    <a:blip r:embed="rId24"/>
+                    <a:blip r:embed="rId26"/>
                     <a:stretch>
                       <a:fillRect/>
                     </a:stretch>
@@ -3509,7 +3900,7 @@
                     <pic:cNvPicPr/>
                   </pic:nvPicPr>
                   <pic:blipFill>
-                    <a:blip r:embed="rId25"/>
+                    <a:blip r:embed="rId27"/>
                     <a:stretch>
                       <a:fillRect/>
                     </a:stretch>
@@ -3539,7 +3930,43 @@
     <w:p/>
     <w:p>
       <w:r>
-        <w:t xml:space="preserve">I think that it looks good, and that the structure and flex box are all working good when the dimension go small. I do wonder weather a lot of text is good to contrast well with the background and the colour of text you have chosen. I think you should either change the colours or make a assability button that makes it so you can change the contrast. On the log page you could change the colour of text in the input box as it is quite hard to read. </w:t>
+        <w:t>I think that it looks good, and that the structure and flex box are all working good when the dimension</w:t>
+      </w:r>
+      <w:r>
+        <w:t>s</w:t>
+      </w:r>
+      <w:r>
+        <w:t xml:space="preserve"> g</w:t>
+      </w:r>
+      <w:r>
+        <w:t xml:space="preserve">et </w:t>
+      </w:r>
+      <w:r>
+        <w:t>small</w:t>
+      </w:r>
+      <w:r>
+        <w:t>er</w:t>
+      </w:r>
+      <w:r>
+        <w:t xml:space="preserve">. I do wonder </w:t>
+      </w:r>
+      <w:r>
+        <w:t xml:space="preserve">whether </w:t>
+      </w:r>
+      <w:r>
+        <w:t>a lot of text is go</w:t>
+      </w:r>
+      <w:r>
+        <w:t>ing</w:t>
+      </w:r>
+      <w:r>
+        <w:t xml:space="preserve"> to contrast well with the background and the colour of text you have chosen. I think you should either change the colours or make </w:t>
+      </w:r>
+      <w:r>
+        <w:t>an accessibility</w:t>
+      </w:r>
+      <w:r>
+        <w:t xml:space="preserve"> button that makes it so you can change the contrast. On the log page you could change the colour of text in the input box as it is quite hard to read. </w:t>
       </w:r>
     </w:p>
     <w:p>
@@ -3571,7 +3998,7 @@
                     <pic:cNvPicPr/>
                   </pic:nvPicPr>
                   <pic:blipFill>
-                    <a:blip r:embed="rId26"/>
+                    <a:blip r:embed="rId28"/>
                     <a:stretch>
                       <a:fillRect/>
                     </a:stretch>
@@ -3609,21 +4036,35 @@
         <w:t xml:space="preserve">I think that you could do some error prevention because right now you can spam the keyboard and it accepts it. </w:t>
       </w:r>
     </w:p>
-    <w:p>
-      <w:r>
+    <w:p/>
+    <w:p/>
+    <w:p/>
+    <w:p/>
+    <w:p/>
+    <w:p/>
+    <w:p>
+      <w:r>
+        <w:t xml:space="preserve">I also think the navigation bar looks clunky, and the add new thesis button is already above the navigation widgets. I think you should remove the log thesis button at the top. </w:t>
+      </w:r>
+    </w:p>
+    <w:p>
+      <w:r>
+        <w:rPr>
+          <w:u w:val="single"/>
+        </w:rPr>
         <w:drawing>
-          <wp:anchor distT="0" distB="0" distL="114300" distR="114300" simplePos="0" relativeHeight="251683840" behindDoc="0" locked="0" layoutInCell="1" allowOverlap="1" wp14:anchorId="0D5F349E" wp14:editId="1872574F">
+          <wp:anchor distT="0" distB="0" distL="114300" distR="114300" simplePos="0" relativeHeight="251696128" behindDoc="0" locked="0" layoutInCell="1" allowOverlap="1" wp14:anchorId="317FC2E7" wp14:editId="004DE928">
             <wp:simplePos x="0" y="0"/>
-            <wp:positionH relativeFrom="column">
-              <wp:posOffset>172133</wp:posOffset>
+            <wp:positionH relativeFrom="margin">
+              <wp:posOffset>3778497</wp:posOffset>
             </wp:positionH>
             <wp:positionV relativeFrom="paragraph">
-              <wp:posOffset>16858</wp:posOffset>
+              <wp:posOffset>129248</wp:posOffset>
             </wp:positionV>
-            <wp:extent cx="2315210" cy="1572260"/>
-            <wp:effectExtent l="0" t="0" r="8890" b="8890"/>
+            <wp:extent cx="1565275" cy="1068070"/>
+            <wp:effectExtent l="0" t="0" r="0" b="0"/>
             <wp:wrapSquare wrapText="bothSides"/>
-            <wp:docPr id="1249195282" name="Picture 1"/>
+            <wp:docPr id="1969522262" name="Picture 1"/>
             <wp:cNvGraphicFramePr>
               <a:graphicFrameLocks xmlns:a="http://schemas.openxmlformats.org/drawingml/2006/main" noChangeAspect="1"/>
             </wp:cNvGraphicFramePr>
@@ -3631,11 +4072,11 @@
               <a:graphicData uri="http://schemas.openxmlformats.org/drawingml/2006/picture">
                 <pic:pic xmlns:pic="http://schemas.openxmlformats.org/drawingml/2006/picture">
                   <pic:nvPicPr>
-                    <pic:cNvPr id="1249195282" name=""/>
+                    <pic:cNvPr id="1969522262" name=""/>
                     <pic:cNvPicPr/>
                   </pic:nvPicPr>
                   <pic:blipFill>
-                    <a:blip r:embed="rId27"/>
+                    <a:blip r:embed="rId29"/>
                     <a:stretch>
                       <a:fillRect/>
                     </a:stretch>
@@ -3643,7 +4084,7 @@
                   <pic:spPr>
                     <a:xfrm>
                       <a:off x="0" y="0"/>
-                      <a:ext cx="2315210" cy="1572260"/>
+                      <a:ext cx="1565275" cy="1068070"/>
                     </a:xfrm>
                     <a:prstGeom prst="rect">
                       <a:avLst/>
@@ -3662,17 +4103,6 @@
         </w:drawing>
       </w:r>
     </w:p>
-    <w:p/>
-    <w:p/>
-    <w:p/>
-    <w:p/>
-    <w:p/>
-    <w:p>
-      <w:r>
-        <w:t xml:space="preserve">I also think the navigation bar looks clunky, and the add new thesis button is already above the navigation widgets. I think you should remove the log thesis button at the top. </w:t>
-      </w:r>
-    </w:p>
-    <w:p/>
     <w:p>
       <w:pPr>
         <w:rPr>
@@ -3702,90 +4132,14 @@
       <w:r>
         <w:t>I have removed the log new thesis in the navigation bar.</w:t>
       </w:r>
-    </w:p>
-    <w:p>
-      <w:pPr>
-        <w:rPr>
-          <w:b/>
-          <w:bCs/>
-          <w:u w:val="single"/>
-        </w:rPr>
-      </w:pPr>
-    </w:p>
-    <w:p/>
+      <w:r>
+        <w:t xml:space="preserve"> + restyled it to have better contrast, and look better. </w:t>
+      </w:r>
+    </w:p>
     <w:p>
       <w:pPr>
         <w:pStyle w:val="ListParagraph"/>
-        <w:rPr>
-          <w:u w:val="single"/>
-        </w:rPr>
-      </w:pPr>
-    </w:p>
-    <w:p>
-      <w:pPr>
-        <w:pStyle w:val="ListParagraph"/>
-        <w:rPr>
-          <w:u w:val="single"/>
-        </w:rPr>
-      </w:pPr>
-    </w:p>
-    <w:p>
-      <w:pPr>
-        <w:pStyle w:val="ListParagraph"/>
-        <w:rPr>
-          <w:u w:val="single"/>
-        </w:rPr>
-      </w:pPr>
-    </w:p>
-    <w:p>
-      <w:pPr>
-        <w:pStyle w:val="ListParagraph"/>
-        <w:rPr>
-          <w:u w:val="single"/>
-        </w:rPr>
-      </w:pPr>
-    </w:p>
-    <w:p>
-      <w:pPr>
-        <w:pStyle w:val="ListParagraph"/>
-        <w:rPr>
-          <w:u w:val="single"/>
-        </w:rPr>
-      </w:pPr>
-    </w:p>
-    <w:p>
-      <w:pPr>
-        <w:pStyle w:val="ListParagraph"/>
-        <w:rPr>
-          <w:u w:val="single"/>
-        </w:rPr>
-      </w:pPr>
-    </w:p>
-    <w:p>
-      <w:pPr>
-        <w:pStyle w:val="ListParagraph"/>
-        <w:rPr>
-          <w:u w:val="single"/>
-        </w:rPr>
-      </w:pPr>
-    </w:p>
-    <w:p>
-      <w:pPr>
-        <w:rPr>
-          <w:b/>
-          <w:bCs/>
-          <w:u w:val="single"/>
-        </w:rPr>
-      </w:pPr>
-      <w:r>
-        <w:rPr>
-          <w:b/>
-          <w:bCs/>
-          <w:highlight w:val="yellow"/>
-          <w:u w:val="single"/>
-        </w:rPr>
-        <w:t>Two methods of project management for planning:</w:t>
-      </w:r>
+      </w:pPr>
     </w:p>
     <w:p>
       <w:pPr>
@@ -3795,7 +4149,184 @@
           <w:numId w:val="2"/>
         </w:numPr>
       </w:pPr>
-      <w:hyperlink r:id="rId28" w:history="1">
+      <w:r>
+        <w:drawing>
+          <wp:anchor distT="0" distB="0" distL="114300" distR="114300" simplePos="0" relativeHeight="251698176" behindDoc="0" locked="0" layoutInCell="1" allowOverlap="1" wp14:anchorId="5B919BCE" wp14:editId="3BDC1231">
+            <wp:simplePos x="0" y="0"/>
+            <wp:positionH relativeFrom="page">
+              <wp:align>right</wp:align>
+            </wp:positionH>
+            <wp:positionV relativeFrom="paragraph">
+              <wp:posOffset>8727</wp:posOffset>
+            </wp:positionV>
+            <wp:extent cx="2133600" cy="676275"/>
+            <wp:effectExtent l="0" t="0" r="0" b="9525"/>
+            <wp:wrapSquare wrapText="bothSides"/>
+            <wp:docPr id="905010345" name="Picture 1"/>
+            <wp:cNvGraphicFramePr>
+              <a:graphicFrameLocks xmlns:a="http://schemas.openxmlformats.org/drawingml/2006/main" noChangeAspect="1"/>
+            </wp:cNvGraphicFramePr>
+            <a:graphic xmlns:a="http://schemas.openxmlformats.org/drawingml/2006/main">
+              <a:graphicData uri="http://schemas.openxmlformats.org/drawingml/2006/picture">
+                <pic:pic xmlns:pic="http://schemas.openxmlformats.org/drawingml/2006/picture">
+                  <pic:nvPicPr>
+                    <pic:cNvPr id="905010345" name=""/>
+                    <pic:cNvPicPr/>
+                  </pic:nvPicPr>
+                  <pic:blipFill>
+                    <a:blip r:embed="rId30"/>
+                    <a:stretch>
+                      <a:fillRect/>
+                    </a:stretch>
+                  </pic:blipFill>
+                  <pic:spPr>
+                    <a:xfrm>
+                      <a:off x="0" y="0"/>
+                      <a:ext cx="2133600" cy="676275"/>
+                    </a:xfrm>
+                    <a:prstGeom prst="rect">
+                      <a:avLst/>
+                    </a:prstGeom>
+                  </pic:spPr>
+                </pic:pic>
+              </a:graphicData>
+            </a:graphic>
+          </wp:anchor>
+        </w:drawing>
+      </w:r>
+      <w:r>
+        <w:t xml:space="preserve">Changed the colour of the text in the input boxes on my form – </w:t>
+      </w:r>
+      <w:r>
+        <w:rPr>
+          <w:b/>
+          <w:bCs/>
+          <w:highlight w:val="yellow"/>
+          <w:u w:val="single"/>
+        </w:rPr>
+        <w:t>see aesthetic optimizations section</w:t>
+      </w:r>
+      <w:r>
+        <w:rPr>
+          <w:b/>
+          <w:bCs/>
+          <w:u w:val="single"/>
+        </w:rPr>
+        <w:t xml:space="preserve"> </w:t>
+      </w:r>
+      <w:hyperlink w:anchor="_Aesthetic_optimizations_to" w:history="1">
+        <w:r>
+          <w:rPr>
+            <w:rStyle w:val="Hyperlink"/>
+            <w:b/>
+            <w:bCs/>
+          </w:rPr>
+          <w:t>(click here)</w:t>
+        </w:r>
+      </w:hyperlink>
+    </w:p>
+    <w:p>
+      <w:pPr>
+        <w:pStyle w:val="ListParagraph"/>
+        <w:numPr>
+          <w:ilvl w:val="0"/>
+          <w:numId w:val="2"/>
+        </w:numPr>
+      </w:pPr>
+    </w:p>
+    <w:p>
+      <w:pPr>
+        <w:rPr>
+          <w:b/>
+          <w:bCs/>
+          <w:u w:val="single"/>
+        </w:rPr>
+      </w:pPr>
+    </w:p>
+    <w:p/>
+    <w:p>
+      <w:pPr>
+        <w:pStyle w:val="ListParagraph"/>
+        <w:rPr>
+          <w:u w:val="single"/>
+        </w:rPr>
+      </w:pPr>
+    </w:p>
+    <w:p>
+      <w:pPr>
+        <w:pStyle w:val="ListParagraph"/>
+        <w:rPr>
+          <w:u w:val="single"/>
+        </w:rPr>
+      </w:pPr>
+    </w:p>
+    <w:p>
+      <w:pPr>
+        <w:pStyle w:val="ListParagraph"/>
+        <w:rPr>
+          <w:u w:val="single"/>
+        </w:rPr>
+      </w:pPr>
+    </w:p>
+    <w:p>
+      <w:pPr>
+        <w:pStyle w:val="ListParagraph"/>
+        <w:rPr>
+          <w:u w:val="single"/>
+        </w:rPr>
+      </w:pPr>
+    </w:p>
+    <w:p>
+      <w:pPr>
+        <w:pStyle w:val="ListParagraph"/>
+        <w:rPr>
+          <w:u w:val="single"/>
+        </w:rPr>
+      </w:pPr>
+    </w:p>
+    <w:p>
+      <w:pPr>
+        <w:pStyle w:val="ListParagraph"/>
+        <w:rPr>
+          <w:u w:val="single"/>
+        </w:rPr>
+      </w:pPr>
+    </w:p>
+    <w:p>
+      <w:pPr>
+        <w:pStyle w:val="ListParagraph"/>
+        <w:rPr>
+          <w:u w:val="single"/>
+        </w:rPr>
+      </w:pPr>
+    </w:p>
+    <w:p>
+      <w:pPr>
+        <w:rPr>
+          <w:b/>
+          <w:bCs/>
+          <w:u w:val="single"/>
+        </w:rPr>
+      </w:pPr>
+      <w:r>
+        <w:rPr>
+          <w:b/>
+          <w:bCs/>
+          <w:highlight w:val="yellow"/>
+          <w:u w:val="single"/>
+        </w:rPr>
+        <w:t>Two methods of project management for planning:</w:t>
+      </w:r>
+    </w:p>
+    <w:p>
+      <w:pPr>
+        <w:pStyle w:val="ListParagraph"/>
+        <w:numPr>
+          <w:ilvl w:val="0"/>
+          <w:numId w:val="2"/>
+        </w:numPr>
+      </w:pPr>
+      <w:hyperlink r:id="rId31" w:history="1">
         <w:r>
           <w:rPr>
             <w:rStyle w:val="Hyperlink"/>
@@ -3812,7 +4343,7 @@
           <w:numId w:val="2"/>
         </w:numPr>
       </w:pPr>
-      <w:hyperlink r:id="rId29" w:history="1">
+      <w:hyperlink r:id="rId32" w:history="1">
         <w:r>
           <w:rPr>
             <w:rStyle w:val="Hyperlink"/>
@@ -3820,12 +4351,47 @@
           <w:t>Comp Sci | Trello</w:t>
         </w:r>
       </w:hyperlink>
+      <w:r>
+        <w:t xml:space="preserve"> </w:t>
+      </w:r>
+    </w:p>
+    <w:p>
+      <w:pPr>
+        <w:pStyle w:val="ListParagraph"/>
+        <w:numPr>
+          <w:ilvl w:val="0"/>
+          <w:numId w:val="2"/>
+        </w:numPr>
+      </w:pPr>
+      <w:r>
+        <w:t xml:space="preserve">+ my </w:t>
+      </w:r>
+      <w:proofErr w:type="spellStart"/>
+      <w:r>
+        <w:t>github</w:t>
+      </w:r>
+      <w:proofErr w:type="spellEnd"/>
+      <w:r>
+        <w:t xml:space="preserve"> repository </w:t>
+      </w:r>
+      <w:hyperlink r:id="rId33" w:history="1">
+        <w:r>
+          <w:rPr>
+            <w:rStyle w:val="Hyperlink"/>
+          </w:rPr>
+          <w:t>OSCARB123123/Standard-2</w:t>
+        </w:r>
+      </w:hyperlink>
+      <w:r>
+        <w:t xml:space="preserve"> which helps me to track version history</w:t>
+      </w:r>
     </w:p>
     <w:p>
       <w:r>
         <w:rPr>
           <w:noProof/>
         </w:rPr>
+        <w:lastRenderedPageBreak/>
         <w:drawing>
           <wp:inline distT="0" distB="0" distL="0" distR="0" wp14:anchorId="66EED7A4" wp14:editId="033608AC">
             <wp:extent cx="1829857" cy="1116855"/>
@@ -3842,7 +4408,7 @@
                     <pic:cNvPicPr/>
                   </pic:nvPicPr>
                   <pic:blipFill>
-                    <a:blip r:embed="rId30" cstate="print">
+                    <a:blip r:embed="rId34" cstate="print">
                       <a:extLst>
                         <a:ext uri="{28A0092B-C50C-407E-A947-70E740481C1C}">
                           <a14:useLocalDpi xmlns:a14="http://schemas.microsoft.com/office/drawing/2010/main" val="0"/>
@@ -3888,7 +4454,7 @@
                     <pic:cNvPicPr/>
                   </pic:nvPicPr>
                   <pic:blipFill>
-                    <a:blip r:embed="rId31" cstate="print">
+                    <a:blip r:embed="rId35" cstate="print">
                       <a:extLst>
                         <a:ext uri="{28A0092B-C50C-407E-A947-70E740481C1C}">
                           <a14:useLocalDpi xmlns:a14="http://schemas.microsoft.com/office/drawing/2010/main" val="0"/>
@@ -3934,7 +4500,7 @@
                     <pic:cNvPicPr/>
                   </pic:nvPicPr>
                   <pic:blipFill>
-                    <a:blip r:embed="rId32" cstate="print">
+                    <a:blip r:embed="rId36" cstate="print">
                       <a:extLst>
                         <a:ext uri="{28A0092B-C50C-407E-A947-70E740481C1C}">
                           <a14:useLocalDpi xmlns:a14="http://schemas.microsoft.com/office/drawing/2010/main" val="0"/>
@@ -3969,7 +4535,6 @@
     </w:p>
     <w:p>
       <w:r>
-        <w:lastRenderedPageBreak/>
         <w:t>Required component breakdown:</w:t>
       </w:r>
     </w:p>
@@ -4063,7 +4628,7 @@
 </file>
 
 <file path=word/numbering.xml><?xml version="1.0" encoding="utf-8"?>
-<w:numbering xmlns:wpc="http://schemas.microsoft.com/office/word/2010/wordprocessingCanvas" xmlns:cx="http://schemas.microsoft.com/office/drawing/2014/chartex" xmlns:cx1="http://schemas.microsoft.com/office/drawing/2015/9/8/chartex" xmlns:cx2="http://schemas.microsoft.com/office/drawing/2015/10/21/chartex" xmlns:cx3="http://schemas.microsoft.com/office/drawing/2016/5/9/chartex" xmlns:cx4="http://schemas.microsoft.com/office/drawing/2016/5/10/chartex" xmlns:cx5="http://schemas.microsoft.com/office/drawing/2016/5/11/chartex" xmlns:cx6="http://schemas.microsoft.com/office/drawing/2016/5/12/chartex" xmlns:cx7="http://schemas.microsoft.com/office/drawing/2016/5/13/chartex" xmlns:cx8="http://schemas.microsoft.com/office/drawing/2016/5/14/chartex" xmlns:mc="http://schemas.openxmlformats.org/markup-compatibility/2006" xmlns:aink="http://schemas.microsoft.com/office/drawing/2016/ink" xmlns:am3d="http://schemas.microsoft.com/office/drawing/2017/model3d" xmlns:o="urn:schemas-microsoft-com:office:office" xmlns:oel="http://schemas.microsoft.com/office/2019/extlst" xmlns:r="http://schemas.openxmlformats.org/officeDocument/2006/relationships" xmlns:m="http://schemas.openxmlformats.org/officeDocument/2006/math" xmlns:v="urn:schemas-microsoft-com:vml" xmlns:wp14="http://schemas.microsoft.com/office/word/2010/wordprocessingDrawing" xmlns:wp="http://schemas.openxmlformats.org/drawingml/2006/wordprocessingDrawing" xmlns:w10="urn:schemas-microsoft-com:office:word" xmlns:w="http://schemas.openxmlformats.org/wordprocessingml/2006/main" xmlns:w14="http://schemas.microsoft.com/office/word/2010/wordml" xmlns:w15="http://schemas.microsoft.com/office/word/2012/wordml" xmlns:w16cex="http://schemas.microsoft.com/office/word/2018/wordml/cex" xmlns:w16cid="http://schemas.microsoft.com/office/word/2016/wordml/cid" xmlns:w16="http://schemas.microsoft.com/office/word/2018/wordml" xmlns:w16du="http://schemas.microsoft.com/office/word/2023/wordml/word16du" xmlns:w16sdtdh="http://schemas.microsoft.com/office/word/2020/wordml/sdtdatahash" xmlns:w16sdtfl="http://schemas.microsoft.com/office/word/2024/wordml/sdtformatlock" xmlns:w16se="http://schemas.microsoft.com/office/word/2015/wordml/symex" xmlns:wpg="http://schemas.microsoft.com/office/word/2010/wordprocessingGroup" xmlns:wpi="http://schemas.microsoft.com/office/word/2010/wordprocessingInk" xmlns:wne="http://schemas.microsoft.com/office/word/2006/wordml" xmlns:wps="http://schemas.microsoft.com/office/word/2010/wordprocessingShape" mc:Ignorable="w14 w15 w16se w16cid w16 w16cex w16sdtdh w16sdtfl w16du wp14">
+<w:numbering xmlns:wpc="http://schemas.microsoft.com/office/word/2010/wordprocessingCanvas" xmlns:cx="http://schemas.microsoft.com/office/drawing/2014/chartex" xmlns:cx1="http://schemas.microsoft.com/office/drawing/2015/9/8/chartex" xmlns:cx2="http://schemas.microsoft.com/office/drawing/2015/10/21/chartex" xmlns:cx3="http://schemas.microsoft.com/office/drawing/2016/5/9/chartex" xmlns:cx4="http://schemas.microsoft.com/office/drawing/2016/5/10/chartex" xmlns:cx5="http://schemas.microsoft.com/office/drawing/2016/5/11/chartex" xmlns:cx6="http://schemas.microsoft.com/office/drawing/2016/5/12/chartex" xmlns:cx7="http://schemas.microsoft.com/office/drawing/2016/5/13/chartex" xmlns:cx8="http://schemas.microsoft.com/office/drawing/2016/5/14/chartex" xmlns:mc="http://schemas.openxmlformats.org/markup-compatibility/2006" xmlns:aink="http://schemas.microsoft.com/office/drawing/2016/ink" xmlns:am3d="http://schemas.microsoft.com/office/drawing/2017/model3d" xmlns:o="urn:schemas-microsoft-com:office:office" xmlns:oel="http://schemas.microsoft.com/office/2019/extlst" xmlns:r="http://schemas.openxmlformats.org/officeDocument/2006/relationships" xmlns:m="http://schemas.openxmlformats.org/officeDocument/2006/math" xmlns:v="urn:schemas-microsoft-com:vml" xmlns:wp14="http://schemas.microsoft.com/office/word/2010/wordprocessingDrawing" xmlns:wp="http://schemas.openxmlformats.org/drawingml/2006/wordprocessingDrawing" xmlns:w10="urn:schemas-microsoft-com:office:word" xmlns:w="http://schemas.openxmlformats.org/wordprocessingml/2006/main" xmlns:w14="http://schemas.microsoft.com/office/word/2010/wordml" xmlns:w15="http://schemas.microsoft.com/office/word/2012/wordml" xmlns:w16cei="http://schemas.microsoft.com/office/word/2026/wordml/cei" xmlns:w16cex="http://schemas.microsoft.com/office/word/2018/wordml/cex" xmlns:w16cid="http://schemas.microsoft.com/office/word/2016/wordml/cid" xmlns:w16="http://schemas.microsoft.com/office/word/2018/wordml" xmlns:w16du="http://schemas.microsoft.com/office/word/2023/wordml/word16du" xmlns:w16sdtdh="http://schemas.microsoft.com/office/word/2020/wordml/sdtdatahash" xmlns:w16sdtfl="http://schemas.microsoft.com/office/word/2024/wordml/sdtformatlock" xmlns:w16se="http://schemas.microsoft.com/office/word/2015/wordml/symex" xmlns:wpg="http://schemas.microsoft.com/office/word/2010/wordprocessingGroup" xmlns:wpi="http://schemas.microsoft.com/office/word/2010/wordprocessingInk" xmlns:wne="http://schemas.microsoft.com/office/word/2006/wordml" xmlns:wps="http://schemas.microsoft.com/office/word/2010/wordprocessingShape" mc:Ignorable="w14 w15 w16se w16cid w16 w16cex w16sdtdh w16sdtfl w16du wp14">
   <w:abstractNum w:abstractNumId="0" w15:restartNumberingAfterBreak="0">
     <w:nsid w:val="0226215A"/>
     <w:multiLevelType w:val="hybridMultilevel"/>
@@ -5109,6 +5674,95 @@
         <w:rFonts w:ascii="Wingdings" w:hAnsi="Wingdings" w:hint="default"/>
         <w:sz w:val="20"/>
       </w:rPr>
+    </w:lvl>
+  </w:abstractNum>
+  <w:abstractNum w:abstractNumId="8" w15:restartNumberingAfterBreak="0">
+    <w:nsid w:val="7E3D2B9D"/>
+    <w:multiLevelType w:val="hybridMultilevel"/>
+    <w:tmpl w:val="6C72D510"/>
+    <w:lvl w:ilvl="0" w:tplc="1409000F">
+      <w:start w:val="1"/>
+      <w:numFmt w:val="decimal"/>
+      <w:lvlText w:val="%1."/>
+      <w:lvlJc w:val="left"/>
+      <w:pPr>
+        <w:ind w:left="720" w:hanging="360"/>
+      </w:pPr>
+      <w:rPr>
+        <w:rFonts w:hint="default"/>
+      </w:rPr>
+    </w:lvl>
+    <w:lvl w:ilvl="1" w:tplc="14090019" w:tentative="1">
+      <w:start w:val="1"/>
+      <w:numFmt w:val="lowerLetter"/>
+      <w:lvlText w:val="%2."/>
+      <w:lvlJc w:val="left"/>
+      <w:pPr>
+        <w:ind w:left="1440" w:hanging="360"/>
+      </w:pPr>
+    </w:lvl>
+    <w:lvl w:ilvl="2" w:tplc="1409001B" w:tentative="1">
+      <w:start w:val="1"/>
+      <w:numFmt w:val="lowerRoman"/>
+      <w:lvlText w:val="%3."/>
+      <w:lvlJc w:val="right"/>
+      <w:pPr>
+        <w:ind w:left="2160" w:hanging="180"/>
+      </w:pPr>
+    </w:lvl>
+    <w:lvl w:ilvl="3" w:tplc="1409000F" w:tentative="1">
+      <w:start w:val="1"/>
+      <w:numFmt w:val="decimal"/>
+      <w:lvlText w:val="%4."/>
+      <w:lvlJc w:val="left"/>
+      <w:pPr>
+        <w:ind w:left="2880" w:hanging="360"/>
+      </w:pPr>
+    </w:lvl>
+    <w:lvl w:ilvl="4" w:tplc="14090019" w:tentative="1">
+      <w:start w:val="1"/>
+      <w:numFmt w:val="lowerLetter"/>
+      <w:lvlText w:val="%5."/>
+      <w:lvlJc w:val="left"/>
+      <w:pPr>
+        <w:ind w:left="3600" w:hanging="360"/>
+      </w:pPr>
+    </w:lvl>
+    <w:lvl w:ilvl="5" w:tplc="1409001B" w:tentative="1">
+      <w:start w:val="1"/>
+      <w:numFmt w:val="lowerRoman"/>
+      <w:lvlText w:val="%6."/>
+      <w:lvlJc w:val="right"/>
+      <w:pPr>
+        <w:ind w:left="4320" w:hanging="180"/>
+      </w:pPr>
+    </w:lvl>
+    <w:lvl w:ilvl="6" w:tplc="1409000F" w:tentative="1">
+      <w:start w:val="1"/>
+      <w:numFmt w:val="decimal"/>
+      <w:lvlText w:val="%7."/>
+      <w:lvlJc w:val="left"/>
+      <w:pPr>
+        <w:ind w:left="5040" w:hanging="360"/>
+      </w:pPr>
+    </w:lvl>
+    <w:lvl w:ilvl="7" w:tplc="14090019" w:tentative="1">
+      <w:start w:val="1"/>
+      <w:numFmt w:val="lowerLetter"/>
+      <w:lvlText w:val="%8."/>
+      <w:lvlJc w:val="left"/>
+      <w:pPr>
+        <w:ind w:left="5760" w:hanging="360"/>
+      </w:pPr>
+    </w:lvl>
+    <w:lvl w:ilvl="8" w:tplc="1409001B" w:tentative="1">
+      <w:start w:val="1"/>
+      <w:numFmt w:val="lowerRoman"/>
+      <w:lvlText w:val="%9."/>
+      <w:lvlJc w:val="right"/>
+      <w:pPr>
+        <w:ind w:left="6480" w:hanging="180"/>
+      </w:pPr>
     </w:lvl>
   </w:abstractNum>
   <w:num w:numId="1" w16cid:durableId="859583245">
@@ -5134,6 +5788,9 @@
   </w:num>
   <w:num w:numId="8" w16cid:durableId="296188093">
     <w:abstractNumId w:val="2"/>
+  </w:num>
+  <w:num w:numId="9" w16cid:durableId="436028294">
+    <w:abstractNumId w:val="8"/>
   </w:num>
 </w:numbering>
 </file>
@@ -5567,7 +6224,6 @@
     <w:next w:val="Normal"/>
     <w:link w:val="Heading2Char"/>
     <w:uiPriority w:val="9"/>
-    <w:semiHidden/>
     <w:unhideWhenUsed/>
     <w:qFormat/>
     <w:rsid w:val="00057F91"/>
@@ -5742,7 +6398,6 @@
   <w:style w:type="character" w:default="1" w:styleId="DefaultParagraphFont">
     <w:name w:val="Default Paragraph Font"/>
     <w:uiPriority w:val="1"/>
-    <w:semiHidden/>
     <w:unhideWhenUsed/>
   </w:style>
   <w:style w:type="table" w:default="1" w:styleId="TableNormal">
@@ -5784,7 +6439,6 @@
     <w:basedOn w:val="DefaultParagraphFont"/>
     <w:link w:val="Heading2"/>
     <w:uiPriority w:val="9"/>
-    <w:semiHidden/>
     <w:rsid w:val="00057F91"/>
     <w:rPr>
       <w:rFonts w:asciiTheme="majorHAnsi" w:eastAsiaTheme="majorEastAsia" w:hAnsiTheme="majorHAnsi" w:cstheme="majorBidi"/>

</xml_diff>

<commit_message>
CSS optimization + comments
</commit_message>
<xml_diff>
--- a/Project Breif.docx
+++ b/Project Breif.docx
@@ -489,962 +489,177 @@
         <w:t xml:space="preserve"> Clean portfolio dashboard with sector exposure by percentage</w:t>
       </w:r>
     </w:p>
+    <w:p>
+      <w:pPr>
+        <w:rPr>
+          <w:b/>
+          <w:bCs/>
+          <w:sz w:val="32"/>
+          <w:szCs w:val="32"/>
+        </w:rPr>
+      </w:pPr>
+      <w:r>
+        <w:rPr>
+          <w:b/>
+          <w:bCs/>
+          <w:sz w:val="32"/>
+          <w:szCs w:val="32"/>
+          <w:highlight w:val="yellow"/>
+        </w:rPr>
+        <w:t>MY wireframe mock-up:</w:t>
+      </w:r>
+    </w:p>
+    <w:p>
+      <w:pPr>
+        <w:rPr>
+          <w:b/>
+          <w:bCs/>
+          <w:sz w:val="32"/>
+          <w:szCs w:val="32"/>
+        </w:rPr>
+      </w:pPr>
+    </w:p>
+    <w:p>
+      <w:pPr>
+        <w:rPr>
+          <w:b/>
+          <w:bCs/>
+          <w:sz w:val="32"/>
+          <w:szCs w:val="32"/>
+        </w:rPr>
+      </w:pPr>
+      <w:r>
+        <w:rPr>
+          <w:noProof/>
+          <w:color w:val="1A3A5C"/>
+        </w:rPr>
+        <w:drawing>
+          <wp:anchor distT="0" distB="0" distL="114300" distR="114300" simplePos="0" relativeHeight="251966464" behindDoc="0" locked="0" layoutInCell="1" allowOverlap="1" wp14:anchorId="273A870B" wp14:editId="7AD65FE1">
+            <wp:simplePos x="0" y="0"/>
+            <wp:positionH relativeFrom="column">
+              <wp:posOffset>2225785</wp:posOffset>
+            </wp:positionH>
+            <wp:positionV relativeFrom="paragraph">
+              <wp:posOffset>41468</wp:posOffset>
+            </wp:positionV>
+            <wp:extent cx="2489835" cy="2030095"/>
+            <wp:effectExtent l="0" t="0" r="5715" b="8255"/>
+            <wp:wrapSquare wrapText="bothSides"/>
+            <wp:docPr id="208451374" name="Picture 1"/>
+            <wp:cNvGraphicFramePr>
+              <a:graphicFrameLocks xmlns:a="http://schemas.openxmlformats.org/drawingml/2006/main" noChangeAspect="1"/>
+            </wp:cNvGraphicFramePr>
+            <a:graphic xmlns:a="http://schemas.openxmlformats.org/drawingml/2006/main">
+              <a:graphicData uri="http://schemas.openxmlformats.org/drawingml/2006/picture">
+                <pic:pic xmlns:pic="http://schemas.openxmlformats.org/drawingml/2006/picture">
+                  <pic:nvPicPr>
+                    <pic:cNvPr id="208451374" name=""/>
+                    <pic:cNvPicPr/>
+                  </pic:nvPicPr>
+                  <pic:blipFill>
+                    <a:blip r:embed="rId5"/>
+                    <a:stretch>
+                      <a:fillRect/>
+                    </a:stretch>
+                  </pic:blipFill>
+                  <pic:spPr>
+                    <a:xfrm>
+                      <a:off x="0" y="0"/>
+                      <a:ext cx="2489835" cy="2030095"/>
+                    </a:xfrm>
+                    <a:prstGeom prst="rect">
+                      <a:avLst/>
+                    </a:prstGeom>
+                  </pic:spPr>
+                </pic:pic>
+              </a:graphicData>
+            </a:graphic>
+            <wp14:sizeRelH relativeFrom="margin">
+              <wp14:pctWidth>0</wp14:pctWidth>
+            </wp14:sizeRelH>
+            <wp14:sizeRelV relativeFrom="margin">
+              <wp14:pctHeight>0</wp14:pctHeight>
+            </wp14:sizeRelV>
+          </wp:anchor>
+        </w:drawing>
+      </w:r>
+      <w:r>
+        <w:rPr>
+          <w:b/>
+          <w:bCs/>
+          <w:noProof/>
+          <w:sz w:val="32"/>
+          <w:szCs w:val="32"/>
+        </w:rPr>
+        <w:drawing>
+          <wp:anchor distT="0" distB="0" distL="114300" distR="114300" simplePos="0" relativeHeight="251964416" behindDoc="0" locked="0" layoutInCell="1" allowOverlap="1" wp14:anchorId="21E9919E" wp14:editId="62DB57E5">
+            <wp:simplePos x="0" y="0"/>
+            <wp:positionH relativeFrom="page">
+              <wp:posOffset>1080770</wp:posOffset>
+            </wp:positionH>
+            <wp:positionV relativeFrom="paragraph">
+              <wp:posOffset>7620</wp:posOffset>
+            </wp:positionV>
+            <wp:extent cx="1470660" cy="1868170"/>
+            <wp:effectExtent l="0" t="0" r="0" b="0"/>
+            <wp:wrapSquare wrapText="bothSides"/>
+            <wp:docPr id="732188924" name="Picture 1"/>
+            <wp:cNvGraphicFramePr>
+              <a:graphicFrameLocks xmlns:a="http://schemas.openxmlformats.org/drawingml/2006/main" noChangeAspect="1"/>
+            </wp:cNvGraphicFramePr>
+            <a:graphic xmlns:a="http://schemas.openxmlformats.org/drawingml/2006/main">
+              <a:graphicData uri="http://schemas.openxmlformats.org/drawingml/2006/picture">
+                <pic:pic xmlns:pic="http://schemas.openxmlformats.org/drawingml/2006/picture">
+                  <pic:nvPicPr>
+                    <pic:cNvPr id="732188924" name=""/>
+                    <pic:cNvPicPr/>
+                  </pic:nvPicPr>
+                  <pic:blipFill>
+                    <a:blip r:embed="rId6"/>
+                    <a:stretch>
+                      <a:fillRect/>
+                    </a:stretch>
+                  </pic:blipFill>
+                  <pic:spPr>
+                    <a:xfrm>
+                      <a:off x="0" y="0"/>
+                      <a:ext cx="1470660" cy="1868170"/>
+                    </a:xfrm>
+                    <a:prstGeom prst="rect">
+                      <a:avLst/>
+                    </a:prstGeom>
+                  </pic:spPr>
+                </pic:pic>
+              </a:graphicData>
+            </a:graphic>
+            <wp14:sizeRelH relativeFrom="margin">
+              <wp14:pctWidth>0</wp14:pctWidth>
+            </wp14:sizeRelH>
+            <wp14:sizeRelV relativeFrom="margin">
+              <wp14:pctHeight>0</wp14:pctHeight>
+            </wp14:sizeRelV>
+          </wp:anchor>
+        </w:drawing>
+      </w:r>
+    </w:p>
     <w:p/>
     <w:p/>
     <w:p>
       <w:pPr>
         <w:pStyle w:val="Heading1"/>
-      </w:pPr>
-      <w:r>
         <w:rPr>
           <w:color w:val="1A3A5C"/>
         </w:rPr>
-        <w:t xml:space="preserve">Advanced techniques </w:t>
-      </w:r>
-    </w:p>
-    <w:tbl>
-      <w:tblPr>
-        <w:tblStyle w:val="TableGrid"/>
-        <w:tblW w:w="0" w:type="auto"/>
-        <w:jc w:val="center"/>
-        <w:tblLook w:val="04A0" w:firstRow="1" w:lastRow="0" w:firstColumn="1" w:lastColumn="0" w:noHBand="0" w:noVBand="1"/>
-      </w:tblPr>
-      <w:tblGrid>
-        <w:gridCol w:w="1910"/>
-        <w:gridCol w:w="2714"/>
-        <w:gridCol w:w="4726"/>
-      </w:tblGrid>
-      <w:tr>
-        <w:trPr>
-          <w:jc w:val="center"/>
-        </w:trPr>
-        <w:tc>
-          <w:tcPr>
-            <w:tcW w:w="2109" w:type="dxa"/>
-            <w:shd w:val="clear" w:color="auto" w:fill="1A3A5C"/>
-          </w:tcPr>
-          <w:p>
-            <w:pPr>
-              <w:spacing w:before="40" w:after="40"/>
-            </w:pPr>
-            <w:r>
-              <w:rPr>
-                <w:b/>
-                <w:color w:val="FFFFFF"/>
-                <w:sz w:val="20"/>
-              </w:rPr>
-              <w:t>Example advanced technique</w:t>
-            </w:r>
-          </w:p>
-        </w:tc>
-        <w:tc>
-          <w:tcPr>
-            <w:tcW w:w="3057" w:type="dxa"/>
-            <w:shd w:val="clear" w:color="auto" w:fill="1A3A5C"/>
-          </w:tcPr>
-          <w:p>
-            <w:pPr>
-              <w:spacing w:before="40" w:after="40"/>
-            </w:pPr>
-            <w:r>
-              <w:rPr>
-                <w:b/>
-                <w:color w:val="FFFFFF"/>
-                <w:sz w:val="20"/>
-              </w:rPr>
-              <w:t>What it might look like</w:t>
-            </w:r>
-          </w:p>
-        </w:tc>
-        <w:tc>
-          <w:tcPr>
-            <w:tcW w:w="3402" w:type="dxa"/>
-            <w:shd w:val="clear" w:color="auto" w:fill="1A3A5C"/>
-          </w:tcPr>
-          <w:p>
-            <w:pPr>
-              <w:spacing w:before="40" w:after="40"/>
-            </w:pPr>
-            <w:r>
-              <w:rPr>
-                <w:b/>
-                <w:color w:val="FFFFFF"/>
-                <w:sz w:val="20"/>
-              </w:rPr>
-              <w:t>Where in my project</w:t>
-            </w:r>
-          </w:p>
-        </w:tc>
-      </w:tr>
-      <w:tr>
-        <w:trPr>
-          <w:jc w:val="center"/>
-        </w:trPr>
-        <w:tc>
-          <w:tcPr>
-            <w:tcW w:w="2109" w:type="dxa"/>
-          </w:tcPr>
-          <w:p>
-            <w:pPr>
-              <w:spacing w:before="40" w:after="40"/>
-            </w:pPr>
-            <w:r>
-              <w:rPr>
-                <w:sz w:val="20"/>
-              </w:rPr>
-              <w:t>CSS custom properties / themes</w:t>
-            </w:r>
-          </w:p>
-        </w:tc>
-        <w:tc>
-          <w:tcPr>
-            <w:tcW w:w="3057" w:type="dxa"/>
-          </w:tcPr>
-          <w:p>
-            <w:pPr>
-              <w:spacing w:before="40" w:after="40"/>
-              <w:rPr>
-                <w:sz w:val="20"/>
-              </w:rPr>
-            </w:pPr>
-            <w:r>
-              <w:rPr>
-                <w:sz w:val="20"/>
-              </w:rPr>
-              <w:t xml:space="preserve">:root tokens for </w:t>
-            </w:r>
-            <w:proofErr w:type="spellStart"/>
-            <w:r>
-              <w:rPr>
-                <w:sz w:val="20"/>
-              </w:rPr>
-              <w:t>colour</w:t>
-            </w:r>
-            <w:proofErr w:type="spellEnd"/>
-            <w:r>
-              <w:rPr>
-                <w:sz w:val="20"/>
-              </w:rPr>
-              <w:t>, space, type</w:t>
-            </w:r>
-          </w:p>
-          <w:p>
-            <w:pPr>
-              <w:spacing w:before="40" w:after="40"/>
-              <w:rPr>
-                <w:sz w:val="20"/>
-              </w:rPr>
-            </w:pPr>
-          </w:p>
-          <w:p>
-            <w:pPr>
-              <w:spacing w:before="40" w:after="40"/>
-            </w:pPr>
-          </w:p>
-        </w:tc>
-        <w:tc>
-          <w:tcPr>
-            <w:tcW w:w="3402" w:type="dxa"/>
-          </w:tcPr>
-          <w:p>
-            <w:pPr>
-              <w:spacing w:before="40" w:after="40"/>
-              <w:rPr>
-                <w:lang w:val="en-NZ"/>
-              </w:rPr>
-            </w:pPr>
-            <w:r>
-              <w:rPr>
-                <w:lang w:val="en-NZ"/>
-              </w:rPr>
-              <w:t>:root {</w:t>
-            </w:r>
-          </w:p>
-          <w:p>
-            <w:pPr>
-              <w:spacing w:before="40" w:after="40"/>
-              <w:rPr>
-                <w:lang w:val="en-NZ"/>
-              </w:rPr>
-            </w:pPr>
-            <w:r>
-              <w:rPr>
-                <w:lang w:val="en-NZ"/>
-              </w:rPr>
-              <w:t xml:space="preserve">    --brown: #7B5132;</w:t>
-            </w:r>
-          </w:p>
-          <w:p>
-            <w:pPr>
-              <w:spacing w:before="40" w:after="40"/>
-              <w:rPr>
-                <w:lang w:val="en-NZ"/>
-              </w:rPr>
-            </w:pPr>
-            <w:r>
-              <w:rPr>
-                <w:lang w:val="en-NZ"/>
-              </w:rPr>
-              <w:t xml:space="preserve">    --apricot: #D98452;</w:t>
-            </w:r>
-          </w:p>
-          <w:p>
-            <w:pPr>
-              <w:spacing w:before="40" w:after="40"/>
-              <w:rPr>
-                <w:lang w:val="en-NZ"/>
-              </w:rPr>
-            </w:pPr>
-            <w:r>
-              <w:rPr>
-                <w:lang w:val="en-NZ"/>
-              </w:rPr>
-              <w:t xml:space="preserve">    --beige: #FFC67E;</w:t>
-            </w:r>
-          </w:p>
-          <w:p>
-            <w:pPr>
-              <w:spacing w:before="40" w:after="40"/>
-              <w:rPr>
-                <w:lang w:val="en-NZ"/>
-              </w:rPr>
-            </w:pPr>
-            <w:r>
-              <w:rPr>
-                <w:lang w:val="en-NZ"/>
-              </w:rPr>
-              <w:t xml:space="preserve">    --off-white: #FFEEC7;</w:t>
-            </w:r>
-          </w:p>
-          <w:p>
-            <w:pPr>
-              <w:spacing w:before="40" w:after="40"/>
-              <w:rPr>
-                <w:lang w:val="en-NZ"/>
-              </w:rPr>
-            </w:pPr>
-            <w:r>
-              <w:rPr>
-                <w:lang w:val="en-NZ"/>
-              </w:rPr>
-              <w:t>}</w:t>
-            </w:r>
-          </w:p>
-          <w:p>
-            <w:pPr>
-              <w:spacing w:before="40" w:after="40"/>
-              <w:rPr>
-                <w:lang w:val="en-NZ"/>
-              </w:rPr>
-            </w:pPr>
-          </w:p>
-          <w:p>
-            <w:pPr>
-              <w:spacing w:before="40" w:after="40"/>
-              <w:rPr>
-                <w:lang w:val="en-NZ"/>
-              </w:rPr>
-            </w:pPr>
-            <w:r>
-              <w:rPr>
-                <w:noProof/>
-              </w:rPr>
-              <w:drawing>
-                <wp:anchor distT="0" distB="0" distL="114300" distR="114300" simplePos="0" relativeHeight="251959296" behindDoc="0" locked="0" layoutInCell="1" allowOverlap="1" wp14:anchorId="20B93299" wp14:editId="697BC55D">
-                  <wp:simplePos x="0" y="0"/>
-                  <wp:positionH relativeFrom="column">
-                    <wp:posOffset>-39465</wp:posOffset>
-                  </wp:positionH>
-                  <wp:positionV relativeFrom="paragraph">
-                    <wp:posOffset>2956358</wp:posOffset>
-                  </wp:positionV>
-                  <wp:extent cx="1517015" cy="716280"/>
-                  <wp:effectExtent l="0" t="0" r="6985" b="7620"/>
-                  <wp:wrapSquare wrapText="bothSides"/>
-                  <wp:docPr id="281800322" name="Picture 1"/>
-                  <wp:cNvGraphicFramePr>
-                    <a:graphicFrameLocks xmlns:a="http://schemas.openxmlformats.org/drawingml/2006/main" noChangeAspect="1"/>
-                  </wp:cNvGraphicFramePr>
-                  <a:graphic xmlns:a="http://schemas.openxmlformats.org/drawingml/2006/main">
-                    <a:graphicData uri="http://schemas.openxmlformats.org/drawingml/2006/picture">
-                      <pic:pic xmlns:pic="http://schemas.openxmlformats.org/drawingml/2006/picture">
-                        <pic:nvPicPr>
-                          <pic:cNvPr id="281800322" name=""/>
-                          <pic:cNvPicPr/>
-                        </pic:nvPicPr>
-                        <pic:blipFill>
-                          <a:blip r:embed="rId5"/>
-                          <a:stretch>
-                            <a:fillRect/>
-                          </a:stretch>
-                        </pic:blipFill>
-                        <pic:spPr>
-                          <a:xfrm>
-                            <a:off x="0" y="0"/>
-                            <a:ext cx="1517015" cy="716280"/>
-                          </a:xfrm>
-                          <a:prstGeom prst="rect">
-                            <a:avLst/>
-                          </a:prstGeom>
-                        </pic:spPr>
-                      </pic:pic>
-                    </a:graphicData>
-                  </a:graphic>
-                  <wp14:sizeRelH relativeFrom="margin">
-                    <wp14:pctWidth>0</wp14:pctWidth>
-                  </wp14:sizeRelH>
-                  <wp14:sizeRelV relativeFrom="margin">
-                    <wp14:pctHeight>0</wp14:pctHeight>
-                  </wp14:sizeRelV>
-                </wp:anchor>
-              </w:drawing>
-            </w:r>
-            <w:r>
-              <w:rPr>
-                <w:noProof/>
-              </w:rPr>
-              <w:drawing>
-                <wp:anchor distT="0" distB="0" distL="114300" distR="114300" simplePos="0" relativeHeight="251958272" behindDoc="0" locked="0" layoutInCell="1" allowOverlap="1" wp14:anchorId="63561203" wp14:editId="00987C92">
-                  <wp:simplePos x="0" y="0"/>
-                  <wp:positionH relativeFrom="column">
-                    <wp:posOffset>-42545</wp:posOffset>
-                  </wp:positionH>
-                  <wp:positionV relativeFrom="paragraph">
-                    <wp:posOffset>1789430</wp:posOffset>
-                  </wp:positionV>
-                  <wp:extent cx="1471930" cy="984885"/>
-                  <wp:effectExtent l="0" t="0" r="0" b="5715"/>
-                  <wp:wrapSquare wrapText="bothSides"/>
-                  <wp:docPr id="751860783" name="Picture 1"/>
-                  <wp:cNvGraphicFramePr>
-                    <a:graphicFrameLocks xmlns:a="http://schemas.openxmlformats.org/drawingml/2006/main" noChangeAspect="1"/>
-                  </wp:cNvGraphicFramePr>
-                  <a:graphic xmlns:a="http://schemas.openxmlformats.org/drawingml/2006/main">
-                    <a:graphicData uri="http://schemas.openxmlformats.org/drawingml/2006/picture">
-                      <pic:pic xmlns:pic="http://schemas.openxmlformats.org/drawingml/2006/picture">
-                        <pic:nvPicPr>
-                          <pic:cNvPr id="751860783" name=""/>
-                          <pic:cNvPicPr/>
-                        </pic:nvPicPr>
-                        <pic:blipFill>
-                          <a:blip r:embed="rId6"/>
-                          <a:stretch>
-                            <a:fillRect/>
-                          </a:stretch>
-                        </pic:blipFill>
-                        <pic:spPr>
-                          <a:xfrm>
-                            <a:off x="0" y="0"/>
-                            <a:ext cx="1471930" cy="984885"/>
-                          </a:xfrm>
-                          <a:prstGeom prst="rect">
-                            <a:avLst/>
-                          </a:prstGeom>
-                        </pic:spPr>
-                      </pic:pic>
-                    </a:graphicData>
-                  </a:graphic>
-                  <wp14:sizeRelH relativeFrom="margin">
-                    <wp14:pctWidth>0</wp14:pctWidth>
-                  </wp14:sizeRelH>
-                  <wp14:sizeRelV relativeFrom="margin">
-                    <wp14:pctHeight>0</wp14:pctHeight>
-                  </wp14:sizeRelV>
-                </wp:anchor>
-              </w:drawing>
-            </w:r>
-            <w:r>
-              <w:rPr>
-                <w:lang w:val="en-NZ"/>
-              </w:rPr>
-              <w:t xml:space="preserve"> I use CSS custom properties in the :root selector to define reusable colours and other design values. These variables are used throughout the interface to maintain a consistent visual style and make the design easier to modify.</w:t>
-            </w:r>
-          </w:p>
-          <w:p>
-            <w:pPr>
-              <w:spacing w:before="40" w:after="40"/>
-            </w:pPr>
-          </w:p>
-          <w:p>
-            <w:pPr>
-              <w:spacing w:before="40" w:after="40"/>
-            </w:pPr>
-          </w:p>
-          <w:p>
-            <w:pPr>
-              <w:spacing w:before="40" w:after="40"/>
-            </w:pPr>
-          </w:p>
-        </w:tc>
-      </w:tr>
-      <w:tr>
-        <w:trPr>
-          <w:jc w:val="center"/>
-        </w:trPr>
-        <w:tc>
-          <w:tcPr>
-            <w:tcW w:w="2109" w:type="dxa"/>
-            <w:shd w:val="clear" w:color="auto" w:fill="F0F4F8"/>
-          </w:tcPr>
-          <w:p>
-            <w:pPr>
-              <w:spacing w:before="40" w:after="40"/>
-            </w:pPr>
-            <w:r>
-              <w:rPr>
-                <w:sz w:val="20"/>
-              </w:rPr>
-              <w:t>Responsive layout system</w:t>
-            </w:r>
-          </w:p>
-        </w:tc>
-        <w:tc>
-          <w:tcPr>
-            <w:tcW w:w="3057" w:type="dxa"/>
-            <w:shd w:val="clear" w:color="auto" w:fill="F0F4F8"/>
-          </w:tcPr>
-          <w:p>
-            <w:pPr>
-              <w:spacing w:before="40" w:after="40"/>
-            </w:pPr>
-            <w:r>
-              <w:rPr>
-                <w:sz w:val="20"/>
-              </w:rPr>
-              <w:t>Mobile-first flex/grid + breakpoints</w:t>
-            </w:r>
-            <w:r>
-              <w:rPr>
-                <w:sz w:val="20"/>
-              </w:rPr>
-              <w:br/>
-            </w:r>
-            <w:r>
-              <w:rPr>
-                <w:sz w:val="20"/>
-              </w:rPr>
-              <w:br/>
-            </w:r>
-            <w:r>
-              <w:t xml:space="preserve">I will use flexbox/ grid and </w:t>
-            </w:r>
-            <w:r>
-              <w:lastRenderedPageBreak/>
-              <w:t>media queries to make the interface adapt to the screen size.</w:t>
-            </w:r>
-          </w:p>
-        </w:tc>
-        <w:tc>
-          <w:tcPr>
-            <w:tcW w:w="3402" w:type="dxa"/>
-            <w:shd w:val="clear" w:color="auto" w:fill="F0F4F8"/>
-          </w:tcPr>
-          <w:p>
-            <w:pPr>
-              <w:spacing w:before="40" w:after="40"/>
-            </w:pPr>
-          </w:p>
-          <w:p>
-            <w:pPr>
-              <w:spacing w:before="40" w:after="40"/>
-              <w:rPr>
-                <w:lang w:val="en-NZ"/>
-              </w:rPr>
-            </w:pPr>
-            <w:r>
-              <w:rPr>
-                <w:lang w:val="en-NZ"/>
-              </w:rPr>
-              <w:t xml:space="preserve"> I use Flexbox/Grid and media queries to create a responsive interface that adapts to different </w:t>
-            </w:r>
-            <w:r>
-              <w:rPr>
-                <w:lang w:val="en-NZ"/>
-              </w:rPr>
-              <w:lastRenderedPageBreak/>
-              <w:t>screen sizes. This allows the dashboard, navigation and content cards to rearrange appropriately on mobile and larger screens, making the outcome usable across different devices.</w:t>
-            </w:r>
-          </w:p>
-          <w:p>
-            <w:pPr>
-              <w:spacing w:before="40" w:after="40"/>
-            </w:pPr>
-            <w:r>
-              <w:rPr>
-                <w:noProof/>
-              </w:rPr>
-              <w:drawing>
-                <wp:anchor distT="0" distB="0" distL="114300" distR="114300" simplePos="0" relativeHeight="251960320" behindDoc="0" locked="0" layoutInCell="1" allowOverlap="1" wp14:anchorId="7066CA02" wp14:editId="39A5C4D9">
-                  <wp:simplePos x="0" y="0"/>
-                  <wp:positionH relativeFrom="column">
-                    <wp:posOffset>-64905</wp:posOffset>
-                  </wp:positionH>
-                  <wp:positionV relativeFrom="paragraph">
-                    <wp:posOffset>6485</wp:posOffset>
-                  </wp:positionV>
-                  <wp:extent cx="2023110" cy="624205"/>
-                  <wp:effectExtent l="0" t="0" r="0" b="4445"/>
-                  <wp:wrapSquare wrapText="bothSides"/>
-                  <wp:docPr id="1101011646" name="Picture 1"/>
-                  <wp:cNvGraphicFramePr>
-                    <a:graphicFrameLocks xmlns:a="http://schemas.openxmlformats.org/drawingml/2006/main" noChangeAspect="1"/>
-                  </wp:cNvGraphicFramePr>
-                  <a:graphic xmlns:a="http://schemas.openxmlformats.org/drawingml/2006/main">
-                    <a:graphicData uri="http://schemas.openxmlformats.org/drawingml/2006/picture">
-                      <pic:pic xmlns:pic="http://schemas.openxmlformats.org/drawingml/2006/picture">
-                        <pic:nvPicPr>
-                          <pic:cNvPr id="1101011646" name=""/>
-                          <pic:cNvPicPr/>
-                        </pic:nvPicPr>
-                        <pic:blipFill>
-                          <a:blip r:embed="rId7"/>
-                          <a:stretch>
-                            <a:fillRect/>
-                          </a:stretch>
-                        </pic:blipFill>
-                        <pic:spPr>
-                          <a:xfrm>
-                            <a:off x="0" y="0"/>
-                            <a:ext cx="2023110" cy="624205"/>
-                          </a:xfrm>
-                          <a:prstGeom prst="rect">
-                            <a:avLst/>
-                          </a:prstGeom>
-                        </pic:spPr>
-                      </pic:pic>
-                    </a:graphicData>
-                  </a:graphic>
-                  <wp14:sizeRelH relativeFrom="margin">
-                    <wp14:pctWidth>0</wp14:pctWidth>
-                  </wp14:sizeRelH>
-                  <wp14:sizeRelV relativeFrom="margin">
-                    <wp14:pctHeight>0</wp14:pctHeight>
-                  </wp14:sizeRelV>
-                </wp:anchor>
-              </w:drawing>
-            </w:r>
-          </w:p>
-        </w:tc>
-      </w:tr>
-      <w:tr>
-        <w:trPr>
-          <w:jc w:val="center"/>
-        </w:trPr>
-        <w:tc>
-          <w:tcPr>
-            <w:tcW w:w="2109" w:type="dxa"/>
-          </w:tcPr>
-          <w:p>
-            <w:pPr>
-              <w:spacing w:before="40" w:after="40"/>
-            </w:pPr>
-            <w:r>
-              <w:rPr>
-                <w:sz w:val="20"/>
-              </w:rPr>
-              <w:lastRenderedPageBreak/>
-              <w:t>Reusable UI pattern</w:t>
-            </w:r>
-          </w:p>
-        </w:tc>
-        <w:tc>
-          <w:tcPr>
-            <w:tcW w:w="3057" w:type="dxa"/>
-          </w:tcPr>
-          <w:p>
-            <w:pPr>
-              <w:spacing w:before="40" w:after="40"/>
-            </w:pPr>
-            <w:r>
-              <w:rPr>
-                <w:sz w:val="20"/>
-              </w:rPr>
-              <w:t>Shared card/component classes or partials</w:t>
-            </w:r>
-          </w:p>
-        </w:tc>
-        <w:tc>
-          <w:tcPr>
-            <w:tcW w:w="3402" w:type="dxa"/>
-          </w:tcPr>
-          <w:p>
-            <w:pPr>
-              <w:spacing w:before="40" w:after="40"/>
-            </w:pPr>
-          </w:p>
-        </w:tc>
-      </w:tr>
-      <w:tr>
-        <w:trPr>
-          <w:jc w:val="center"/>
-        </w:trPr>
-        <w:tc>
-          <w:tcPr>
-            <w:tcW w:w="2109" w:type="dxa"/>
-            <w:shd w:val="clear" w:color="auto" w:fill="F0F4F8"/>
-          </w:tcPr>
-          <w:p>
-            <w:pPr>
-              <w:spacing w:before="40" w:after="40"/>
-            </w:pPr>
-            <w:r>
-              <w:rPr>
-                <w:sz w:val="20"/>
-              </w:rPr>
-              <w:t>Data-driven content</w:t>
-            </w:r>
-          </w:p>
-        </w:tc>
-        <w:tc>
-          <w:tcPr>
-            <w:tcW w:w="3057" w:type="dxa"/>
-            <w:shd w:val="clear" w:color="auto" w:fill="F0F4F8"/>
-          </w:tcPr>
-          <w:p>
-            <w:pPr>
-              <w:spacing w:before="40" w:after="40"/>
-            </w:pPr>
-            <w:r>
-              <w:rPr>
-                <w:sz w:val="20"/>
-              </w:rPr>
-              <w:t>JSON/CSV mapped to visible UI</w:t>
-            </w:r>
-          </w:p>
-        </w:tc>
-        <w:tc>
-          <w:tcPr>
-            <w:tcW w:w="3402" w:type="dxa"/>
-            <w:shd w:val="clear" w:color="auto" w:fill="F0F4F8"/>
-          </w:tcPr>
-          <w:p>
-            <w:pPr>
-              <w:spacing w:before="40" w:after="40"/>
-            </w:pPr>
-            <w:r>
-              <w:t xml:space="preserve">Json and </w:t>
-            </w:r>
-            <w:proofErr w:type="spellStart"/>
-            <w:r>
-              <w:t>localstorage</w:t>
-            </w:r>
-            <w:proofErr w:type="spellEnd"/>
-            <w:r>
-              <w:t xml:space="preserve"> to save users thesis parts. The data will be accessible in the users ‘saved theses’ box on the home page of the dashboard. </w:t>
-            </w:r>
-            <w:r>
-              <w:br/>
-              <w:t xml:space="preserve"> </w:t>
-            </w:r>
-          </w:p>
-          <w:p>
-            <w:pPr>
-              <w:spacing w:before="40" w:after="40"/>
-            </w:pPr>
-            <w:r>
-              <w:t>When clicked on in the saved theses section, saved thesis data populates a form showing all the information that was entered previously, organized neatly.</w:t>
-            </w:r>
-          </w:p>
-          <w:p>
-            <w:pPr>
-              <w:spacing w:before="40" w:after="40"/>
-            </w:pPr>
-            <w:r>
-              <w:drawing>
-                <wp:anchor distT="0" distB="0" distL="114300" distR="114300" simplePos="0" relativeHeight="251962368" behindDoc="0" locked="0" layoutInCell="1" allowOverlap="1" wp14:anchorId="3D162DA9" wp14:editId="7D555DE2">
-                  <wp:simplePos x="0" y="0"/>
-                  <wp:positionH relativeFrom="column">
-                    <wp:posOffset>-65315</wp:posOffset>
-                  </wp:positionH>
-                  <wp:positionV relativeFrom="paragraph">
-                    <wp:posOffset>274682</wp:posOffset>
-                  </wp:positionV>
-                  <wp:extent cx="2864304" cy="658604"/>
-                  <wp:effectExtent l="0" t="0" r="0" b="8255"/>
-                  <wp:wrapSquare wrapText="bothSides"/>
-                  <wp:docPr id="400196166" name="Picture 1"/>
-                  <wp:cNvGraphicFramePr>
-                    <a:graphicFrameLocks xmlns:a="http://schemas.openxmlformats.org/drawingml/2006/main" noChangeAspect="1"/>
-                  </wp:cNvGraphicFramePr>
-                  <a:graphic xmlns:a="http://schemas.openxmlformats.org/drawingml/2006/main">
-                    <a:graphicData uri="http://schemas.openxmlformats.org/drawingml/2006/picture">
-                      <pic:pic xmlns:pic="http://schemas.openxmlformats.org/drawingml/2006/picture">
-                        <pic:nvPicPr>
-                          <pic:cNvPr id="400196166" name=""/>
-                          <pic:cNvPicPr/>
-                        </pic:nvPicPr>
-                        <pic:blipFill>
-                          <a:blip r:embed="rId8"/>
-                          <a:stretch>
-                            <a:fillRect/>
-                          </a:stretch>
-                        </pic:blipFill>
-                        <pic:spPr>
-                          <a:xfrm>
-                            <a:off x="0" y="0"/>
-                            <a:ext cx="2864304" cy="658604"/>
-                          </a:xfrm>
-                          <a:prstGeom prst="rect">
-                            <a:avLst/>
-                          </a:prstGeom>
-                        </pic:spPr>
-                      </pic:pic>
-                    </a:graphicData>
-                  </a:graphic>
-                  <wp14:sizeRelH relativeFrom="margin">
-                    <wp14:pctWidth>0</wp14:pctWidth>
-                  </wp14:sizeRelH>
-                  <wp14:sizeRelV relativeFrom="margin">
-                    <wp14:pctHeight>0</wp14:pctHeight>
-                  </wp14:sizeRelV>
-                </wp:anchor>
-              </w:drawing>
-            </w:r>
-          </w:p>
-          <w:p>
-            <w:pPr>
-              <w:spacing w:before="40" w:after="40"/>
-            </w:pPr>
-          </w:p>
-        </w:tc>
-      </w:tr>
-      <w:tr>
-        <w:trPr>
-          <w:jc w:val="center"/>
-        </w:trPr>
-        <w:tc>
-          <w:tcPr>
-            <w:tcW w:w="2109" w:type="dxa"/>
-          </w:tcPr>
-          <w:p>
-            <w:pPr>
-              <w:spacing w:before="40" w:after="40"/>
-            </w:pPr>
-            <w:r>
-              <w:rPr>
-                <w:sz w:val="20"/>
-              </w:rPr>
-              <w:t>Scripts / interactivity</w:t>
-            </w:r>
-          </w:p>
-        </w:tc>
-        <w:tc>
-          <w:tcPr>
-            <w:tcW w:w="3057" w:type="dxa"/>
-          </w:tcPr>
-          <w:p>
-            <w:pPr>
-              <w:spacing w:before="40" w:after="40"/>
-            </w:pPr>
-            <w:r>
-              <w:rPr>
-                <w:sz w:val="20"/>
-              </w:rPr>
-              <w:t>Custom JS for filters, tabs, states</w:t>
-            </w:r>
-          </w:p>
-        </w:tc>
-        <w:tc>
-          <w:tcPr>
-            <w:tcW w:w="3402" w:type="dxa"/>
-          </w:tcPr>
-          <w:p>
-            <w:pPr>
-              <w:spacing w:before="40" w:after="40"/>
-            </w:pPr>
-          </w:p>
-        </w:tc>
-      </w:tr>
-      <w:tr>
-        <w:trPr>
-          <w:jc w:val="center"/>
-        </w:trPr>
-        <w:tc>
-          <w:tcPr>
-            <w:tcW w:w="2109" w:type="dxa"/>
-            <w:shd w:val="clear" w:color="auto" w:fill="F0F4F8"/>
-          </w:tcPr>
-          <w:p>
-            <w:pPr>
-              <w:spacing w:before="40" w:after="40"/>
-            </w:pPr>
-            <w:r>
-              <w:rPr>
-                <w:sz w:val="20"/>
-              </w:rPr>
-              <w:t>Third-party library</w:t>
-            </w:r>
-          </w:p>
-        </w:tc>
-        <w:tc>
-          <w:tcPr>
-            <w:tcW w:w="3057" w:type="dxa"/>
-            <w:shd w:val="clear" w:color="auto" w:fill="F0F4F8"/>
-          </w:tcPr>
-          <w:p>
-            <w:pPr>
-              <w:spacing w:before="40" w:after="40"/>
-            </w:pPr>
-            <w:r>
-              <w:rPr>
-                <w:sz w:val="20"/>
-              </w:rPr>
-              <w:t>Charts, icons, UI kit used with understanding</w:t>
-            </w:r>
-          </w:p>
-        </w:tc>
-        <w:tc>
-          <w:tcPr>
-            <w:tcW w:w="3402" w:type="dxa"/>
-            <w:shd w:val="clear" w:color="auto" w:fill="F0F4F8"/>
-          </w:tcPr>
-          <w:p>
-            <w:pPr>
-              <w:spacing w:before="40" w:after="40"/>
-            </w:pPr>
-          </w:p>
-        </w:tc>
-      </w:tr>
-      <w:tr>
-        <w:trPr>
-          <w:jc w:val="center"/>
-        </w:trPr>
-        <w:tc>
-          <w:tcPr>
-            <w:tcW w:w="2109" w:type="dxa"/>
-          </w:tcPr>
-          <w:p>
-            <w:pPr>
-              <w:spacing w:before="40" w:after="40"/>
-            </w:pPr>
-            <w:r>
-              <w:rPr>
-                <w:sz w:val="20"/>
-              </w:rPr>
-              <w:t xml:space="preserve">Asset pipeline / </w:t>
-            </w:r>
-            <w:proofErr w:type="spellStart"/>
-            <w:r>
-              <w:rPr>
-                <w:sz w:val="20"/>
-              </w:rPr>
-              <w:t>optimisation</w:t>
-            </w:r>
-            <w:proofErr w:type="spellEnd"/>
-          </w:p>
-        </w:tc>
-        <w:tc>
-          <w:tcPr>
-            <w:tcW w:w="3057" w:type="dxa"/>
-          </w:tcPr>
-          <w:p>
-            <w:pPr>
-              <w:spacing w:before="40" w:after="40"/>
-            </w:pPr>
-            <w:r>
-              <w:rPr>
-                <w:sz w:val="20"/>
-              </w:rPr>
-              <w:t>Compressed images, sprites, consistent paths</w:t>
-            </w:r>
-          </w:p>
-        </w:tc>
-        <w:tc>
-          <w:tcPr>
-            <w:tcW w:w="3402" w:type="dxa"/>
-          </w:tcPr>
-          <w:p>
-            <w:pPr>
-              <w:spacing w:before="40" w:after="40"/>
-            </w:pPr>
-          </w:p>
-        </w:tc>
-      </w:tr>
-    </w:tbl>
-    <w:p/>
-    <w:p>
-      <w:pPr>
-        <w:spacing w:after="40"/>
-        <w:rPr>
-          <w:u w:val="single"/>
-        </w:rPr>
-      </w:pPr>
-      <w:r>
-        <w:rPr>
-          <w:b/>
-          <w:highlight w:val="yellow"/>
-          <w:u w:val="single"/>
-        </w:rPr>
-        <w:t>Gaps I still need to add:</w:t>
-      </w:r>
-    </w:p>
-    <w:p>
-      <w:pPr>
-        <w:pStyle w:val="ListParagraph"/>
-        <w:numPr>
-          <w:ilvl w:val="0"/>
-          <w:numId w:val="2"/>
-        </w:numPr>
-        <w:spacing w:after="40"/>
-        <w:rPr>
-          <w:color w:val="AAAAAA"/>
-          <w:sz w:val="20"/>
-        </w:rPr>
-      </w:pPr>
-    </w:p>
-    <w:p>
-      <w:pPr>
-        <w:spacing w:after="40"/>
-        <w:rPr>
-          <w:b/>
-          <w:u w:val="single"/>
-        </w:rPr>
-      </w:pPr>
-      <w:r>
-        <w:rPr>
-          <w:b/>
-          <w:highlight w:val="yellow"/>
-          <w:u w:val="single"/>
-        </w:rPr>
-        <w:t>My ≥2 techniques for assessment:</w:t>
-      </w:r>
-    </w:p>
-    <w:p>
-      <w:pPr>
-        <w:pStyle w:val="ListParagraph"/>
-        <w:numPr>
-          <w:ilvl w:val="0"/>
-          <w:numId w:val="2"/>
-        </w:numPr>
-        <w:spacing w:after="40"/>
-      </w:pPr>
-      <w:r>
-        <w:t>I am going</w:t>
-      </w:r>
-      <w:r>
-        <w:t xml:space="preserve"> to use a JSON file to track users investment thesis and options. I have chosen this because it allows me to record a lot of data, for different users and populate more than one html file with this data. I also like how easy it is to save things to it from my previous assessment.</w:t>
-      </w:r>
-    </w:p>
-    <w:p>
-      <w:pPr>
-        <w:pStyle w:val="ListParagraph"/>
-        <w:numPr>
-          <w:ilvl w:val="0"/>
-          <w:numId w:val="2"/>
-        </w:numPr>
-        <w:spacing w:after="40"/>
-      </w:pPr>
-      <w:r>
-        <w:lastRenderedPageBreak/>
-        <w:t xml:space="preserve">Responsive system layout using flexbox / grid to ensure my interface can be used on mobile devices and larger screens. This makes it more accessible to a greater amount of users, and especially casual investors which is most people. </w:t>
-      </w:r>
-    </w:p>
-    <w:p/>
-    <w:p/>
-    <w:p/>
-    <w:p/>
-    <w:p/>
-    <w:p/>
+      </w:pPr>
+    </w:p>
+    <w:p>
+      <w:pPr>
+        <w:pStyle w:val="Heading1"/>
+        <w:rPr>
+          <w:color w:val="1A3A5C"/>
+        </w:rPr>
+      </w:pPr>
+    </w:p>
     <w:p>
       <w:pPr>
         <w:rPr>
@@ -1457,62 +672,16 @@
       </w:pPr>
       <w:r>
         <w:rPr>
-          <w:b/>
-          <w:bCs/>
-          <w:sz w:val="28"/>
-          <w:szCs w:val="28"/>
-          <w:highlight w:val="yellow"/>
-          <w:u w:val="single"/>
-        </w:rPr>
-        <w:t>Ideation</w:t>
-      </w:r>
-      <w:r>
-        <w:rPr>
-          <w:b/>
-          <w:bCs/>
-          <w:sz w:val="28"/>
-          <w:szCs w:val="28"/>
-          <w:highlight w:val="yellow"/>
-          <w:u w:val="single"/>
-        </w:rPr>
-        <w:t xml:space="preserve"> </w:t>
-      </w:r>
-      <w:r>
-        <w:rPr>
-          <w:b/>
-          <w:bCs/>
-          <w:sz w:val="28"/>
-          <w:szCs w:val="28"/>
-          <w:highlight w:val="yellow"/>
-          <w:u w:val="single"/>
-        </w:rPr>
-        <w:t>:</w:t>
-      </w:r>
-    </w:p>
-    <w:p>
-      <w:r>
-        <w:t>Homepage that looks something like this</w:t>
-      </w:r>
-    </w:p>
-    <w:p>
-      <w:pPr>
-        <w:rPr>
-          <w:b/>
-          <w:bCs/>
-        </w:rPr>
-      </w:pPr>
-      <w:r>
-        <w:rPr>
           <w:noProof/>
         </w:rPr>
         <w:drawing>
-          <wp:anchor distT="0" distB="0" distL="114300" distR="114300" simplePos="0" relativeHeight="251658240" behindDoc="0" locked="0" layoutInCell="1" allowOverlap="1" wp14:anchorId="42693D4A" wp14:editId="2B86A9D1">
+          <wp:anchor distT="0" distB="0" distL="114300" distR="114300" simplePos="0" relativeHeight="251968512" behindDoc="0" locked="0" layoutInCell="1" allowOverlap="1" wp14:anchorId="5407ACBE" wp14:editId="3DD5ECBA">
             <wp:simplePos x="0" y="0"/>
             <wp:positionH relativeFrom="column">
-              <wp:posOffset>3115741</wp:posOffset>
+              <wp:posOffset>4440676</wp:posOffset>
             </wp:positionH>
             <wp:positionV relativeFrom="paragraph">
-              <wp:posOffset>4775</wp:posOffset>
+              <wp:posOffset>238353</wp:posOffset>
             </wp:positionV>
             <wp:extent cx="1703070" cy="1277620"/>
             <wp:effectExtent l="0" t="0" r="0" b="0"/>
@@ -1531,7 +700,7 @@
                     </pic:cNvPicPr>
                   </pic:nvPicPr>
                   <pic:blipFill>
-                    <a:blip r:embed="rId9">
+                    <a:blip r:embed="rId7">
                       <a:extLst>
                         <a:ext uri="{28A0092B-C50C-407E-A947-70E740481C1C}">
                           <a14:useLocalDpi xmlns:a14="http://schemas.microsoft.com/office/drawing/2010/main" val="0"/>
@@ -1566,6 +735,52 @@
         <w:rPr>
           <w:b/>
           <w:bCs/>
+          <w:sz w:val="28"/>
+          <w:szCs w:val="28"/>
+          <w:highlight w:val="yellow"/>
+          <w:u w:val="single"/>
+        </w:rPr>
+        <w:t>Planning</w:t>
+      </w:r>
+      <w:r>
+        <w:rPr>
+          <w:b/>
+          <w:bCs/>
+          <w:sz w:val="28"/>
+          <w:szCs w:val="28"/>
+          <w:highlight w:val="yellow"/>
+          <w:u w:val="single"/>
+        </w:rPr>
+        <w:t xml:space="preserve"> </w:t>
+      </w:r>
+      <w:r>
+        <w:rPr>
+          <w:b/>
+          <w:bCs/>
+          <w:sz w:val="28"/>
+          <w:szCs w:val="28"/>
+          <w:highlight w:val="yellow"/>
+          <w:u w:val="single"/>
+        </w:rPr>
+        <w:t>:</w:t>
+      </w:r>
+    </w:p>
+    <w:p>
+      <w:r>
+        <w:t>Homepage that looks something like this</w:t>
+      </w:r>
+    </w:p>
+    <w:p>
+      <w:pPr>
+        <w:rPr>
+          <w:b/>
+          <w:bCs/>
+        </w:rPr>
+      </w:pPr>
+      <w:r>
+        <w:rPr>
+          <w:b/>
+          <w:bCs/>
         </w:rPr>
         <w:t>Review Urgency Heatmap</w:t>
       </w:r>
@@ -1604,33 +819,17 @@
         </w:numPr>
       </w:pPr>
       <w:r>
-        <w:t xml:space="preserve">Yellow = review due soon </w:t>
-      </w:r>
-    </w:p>
-    <w:p>
-      <w:pPr>
-        <w:numPr>
-          <w:ilvl w:val="0"/>
-          <w:numId w:val="4"/>
-        </w:numPr>
-      </w:pPr>
-      <w:r>
-        <w:t xml:space="preserve">Red = overdue review </w:t>
-      </w:r>
-    </w:p>
-    <w:p>
-      <w:r>
         <w:rPr>
           <w:noProof/>
         </w:rPr>
         <w:drawing>
-          <wp:anchor distT="0" distB="0" distL="114300" distR="114300" simplePos="0" relativeHeight="251659264" behindDoc="0" locked="0" layoutInCell="1" allowOverlap="1" wp14:anchorId="6784BBF7" wp14:editId="56020917">
+          <wp:anchor distT="0" distB="0" distL="114300" distR="114300" simplePos="0" relativeHeight="251969536" behindDoc="0" locked="0" layoutInCell="1" allowOverlap="1" wp14:anchorId="16FF3C30" wp14:editId="3C372BAE">
             <wp:simplePos x="0" y="0"/>
             <wp:positionH relativeFrom="margin">
-              <wp:align>right</wp:align>
+              <wp:posOffset>5441550</wp:posOffset>
             </wp:positionH>
             <wp:positionV relativeFrom="paragraph">
-              <wp:posOffset>282542</wp:posOffset>
+              <wp:posOffset>388149</wp:posOffset>
             </wp:positionV>
             <wp:extent cx="1092200" cy="1099820"/>
             <wp:effectExtent l="0" t="0" r="0" b="5080"/>
@@ -1647,7 +846,7 @@
                     <pic:cNvPicPr/>
                   </pic:nvPicPr>
                   <pic:blipFill>
-                    <a:blip r:embed="rId10" cstate="print">
+                    <a:blip r:embed="rId8" cstate="print">
                       <a:extLst>
                         <a:ext uri="{28A0092B-C50C-407E-A947-70E740481C1C}">
                           <a14:useLocalDpi xmlns:a14="http://schemas.microsoft.com/office/drawing/2010/main" val="0"/>
@@ -1684,16 +883,16 @@
           <w:noProof/>
         </w:rPr>
         <w:drawing>
-          <wp:anchor distT="0" distB="0" distL="114300" distR="114300" simplePos="0" relativeHeight="251660288" behindDoc="0" locked="0" layoutInCell="1" allowOverlap="1" wp14:anchorId="5A2686F4" wp14:editId="441ADFA1">
+          <wp:anchor distT="0" distB="0" distL="114300" distR="114300" simplePos="0" relativeHeight="251970560" behindDoc="0" locked="0" layoutInCell="1" allowOverlap="1" wp14:anchorId="28A01F69" wp14:editId="691DEDC2">
             <wp:simplePos x="0" y="0"/>
-            <wp:positionH relativeFrom="column">
-              <wp:posOffset>-672948</wp:posOffset>
+            <wp:positionH relativeFrom="margin">
+              <wp:align>left</wp:align>
             </wp:positionH>
             <wp:positionV relativeFrom="paragraph">
-              <wp:posOffset>169672</wp:posOffset>
+              <wp:posOffset>341059</wp:posOffset>
             </wp:positionV>
-            <wp:extent cx="3906520" cy="1612900"/>
-            <wp:effectExtent l="0" t="0" r="0" b="6350"/>
+            <wp:extent cx="2326005" cy="960120"/>
+            <wp:effectExtent l="0" t="0" r="0" b="0"/>
             <wp:wrapSquare wrapText="bothSides"/>
             <wp:docPr id="754534159" name="Picture 1"/>
             <wp:cNvGraphicFramePr>
@@ -1707,7 +906,7 @@
                     <pic:cNvPicPr/>
                   </pic:nvPicPr>
                   <pic:blipFill>
-                    <a:blip r:embed="rId11" cstate="print">
+                    <a:blip r:embed="rId9" cstate="print">
                       <a:extLst>
                         <a:ext uri="{28A0092B-C50C-407E-A947-70E740481C1C}">
                           <a14:useLocalDpi xmlns:a14="http://schemas.microsoft.com/office/drawing/2010/main" val="0"/>
@@ -1721,7 +920,7 @@
                   <pic:spPr>
                     <a:xfrm>
                       <a:off x="0" y="0"/>
-                      <a:ext cx="3906520" cy="1612900"/>
+                      <a:ext cx="2326005" cy="960120"/>
                     </a:xfrm>
                     <a:prstGeom prst="rect">
                       <a:avLst/>
@@ -1739,17 +938,23 @@
           </wp:anchor>
         </w:drawing>
       </w:r>
-    </w:p>
-    <w:p>
-      <w:pPr>
-        <w:pStyle w:val="Heading1"/>
-        <w:rPr>
-          <w:color w:val="1A3A5C"/>
-        </w:rPr>
-      </w:pPr>
-    </w:p>
-    <w:p>
-      <w:hyperlink r:id="rId12" w:history="1">
+      <w:r>
+        <w:t>Yellow = review due soon</w:t>
+      </w:r>
+    </w:p>
+    <w:p>
+      <w:pPr>
+        <w:numPr>
+          <w:ilvl w:val="0"/>
+          <w:numId w:val="4"/>
+        </w:numPr>
+      </w:pPr>
+      <w:r>
+        <w:t xml:space="preserve">Red = overdue review </w:t>
+      </w:r>
+    </w:p>
+    <w:p>
+      <w:hyperlink r:id="rId10" w:history="1">
         <w:proofErr w:type="spellStart"/>
         <w:r>
           <w:rPr>
@@ -1774,7 +979,7 @@
       </w:hyperlink>
     </w:p>
     <w:p>
-      <w:hyperlink r:id="rId13" w:history="1">
+      <w:hyperlink r:id="rId11" w:history="1">
         <w:r>
           <w:rPr>
             <w:rStyle w:val="Hyperlink"/>
@@ -1783,48 +988,6 @@
         </w:r>
       </w:hyperlink>
     </w:p>
-    <w:p/>
-    <w:p/>
-    <w:p/>
-    <w:p>
-      <w:r>
-        <w:t xml:space="preserve">Ai animated </w:t>
-      </w:r>
-      <w:proofErr w:type="spellStart"/>
-      <w:r>
-        <w:t>javascript</w:t>
-      </w:r>
-      <w:proofErr w:type="spellEnd"/>
-      <w:r>
-        <w:t xml:space="preserve"> blackhole inspired by the </w:t>
-      </w:r>
-      <w:proofErr w:type="spellStart"/>
-      <w:r>
-        <w:t>tradingview</w:t>
-      </w:r>
-      <w:proofErr w:type="spellEnd"/>
-      <w:r>
-        <w:t xml:space="preserve"> </w:t>
-      </w:r>
-    </w:p>
-    <w:p/>
-    <w:p/>
-    <w:p/>
-    <w:p/>
-    <w:p/>
-    <w:p>
-      <w:pPr>
-        <w:rPr>
-          <w:lang w:val="fr-FR"/>
-        </w:rPr>
-      </w:pPr>
-      <w:r>
-        <w:rPr>
-          <w:lang w:val="fr-FR"/>
-        </w:rPr>
-        <w:t>P</w:t>
-      </w:r>
-    </w:p>
     <w:p>
       <w:pPr>
         <w:rPr>
@@ -1832,7 +995,7 @@
           <w:lang w:val="fr-FR"/>
         </w:rPr>
       </w:pPr>
-      <w:hyperlink r:id="rId14" w:history="1">
+      <w:hyperlink r:id="rId12" w:history="1">
         <w:proofErr w:type="spellStart"/>
         <w:r>
           <w:rPr>
@@ -1881,13 +1044,964 @@
         </w:rPr>
       </w:pPr>
     </w:p>
-    <w:p>
-      <w:pPr>
-        <w:rPr>
-          <w:lang w:val="fr-FR"/>
-        </w:rPr>
-      </w:pPr>
-    </w:p>
+    <w:p/>
+    <w:p>
+      <w:pPr>
+        <w:pStyle w:val="Heading1"/>
+        <w:rPr>
+          <w:color w:val="1A3A5C"/>
+        </w:rPr>
+      </w:pPr>
+    </w:p>
+    <w:p>
+      <w:pPr>
+        <w:pStyle w:val="Heading1"/>
+        <w:rPr>
+          <w:color w:val="1A3A5C"/>
+        </w:rPr>
+      </w:pPr>
+    </w:p>
+    <w:p>
+      <w:pPr>
+        <w:pStyle w:val="Heading1"/>
+      </w:pPr>
+      <w:r>
+        <w:rPr>
+          <w:color w:val="1A3A5C"/>
+        </w:rPr>
+        <w:t xml:space="preserve">Advanced techniques </w:t>
+      </w:r>
+    </w:p>
+    <w:tbl>
+      <w:tblPr>
+        <w:tblStyle w:val="TableGrid"/>
+        <w:tblW w:w="0" w:type="auto"/>
+        <w:jc w:val="center"/>
+        <w:tblLook w:val="04A0" w:firstRow="1" w:lastRow="0" w:firstColumn="1" w:lastColumn="0" w:noHBand="0" w:noVBand="1"/>
+      </w:tblPr>
+      <w:tblGrid>
+        <w:gridCol w:w="1910"/>
+        <w:gridCol w:w="2714"/>
+        <w:gridCol w:w="4726"/>
+      </w:tblGrid>
+      <w:tr>
+        <w:trPr>
+          <w:jc w:val="center"/>
+        </w:trPr>
+        <w:tc>
+          <w:tcPr>
+            <w:tcW w:w="2109" w:type="dxa"/>
+            <w:shd w:val="clear" w:color="auto" w:fill="1A3A5C"/>
+          </w:tcPr>
+          <w:p>
+            <w:pPr>
+              <w:spacing w:before="40" w:after="40"/>
+            </w:pPr>
+            <w:r>
+              <w:rPr>
+                <w:b/>
+                <w:color w:val="FFFFFF"/>
+                <w:sz w:val="20"/>
+              </w:rPr>
+              <w:t>Example advanced technique</w:t>
+            </w:r>
+          </w:p>
+        </w:tc>
+        <w:tc>
+          <w:tcPr>
+            <w:tcW w:w="3057" w:type="dxa"/>
+            <w:shd w:val="clear" w:color="auto" w:fill="1A3A5C"/>
+          </w:tcPr>
+          <w:p>
+            <w:pPr>
+              <w:spacing w:before="40" w:after="40"/>
+            </w:pPr>
+            <w:r>
+              <w:rPr>
+                <w:b/>
+                <w:color w:val="FFFFFF"/>
+                <w:sz w:val="20"/>
+              </w:rPr>
+              <w:t>What it might look like</w:t>
+            </w:r>
+          </w:p>
+        </w:tc>
+        <w:tc>
+          <w:tcPr>
+            <w:tcW w:w="3402" w:type="dxa"/>
+            <w:shd w:val="clear" w:color="auto" w:fill="1A3A5C"/>
+          </w:tcPr>
+          <w:p>
+            <w:pPr>
+              <w:spacing w:before="40" w:after="40"/>
+            </w:pPr>
+            <w:r>
+              <w:rPr>
+                <w:b/>
+                <w:color w:val="FFFFFF"/>
+                <w:sz w:val="20"/>
+              </w:rPr>
+              <w:t>Where in my project</w:t>
+            </w:r>
+          </w:p>
+        </w:tc>
+      </w:tr>
+      <w:tr>
+        <w:trPr>
+          <w:jc w:val="center"/>
+        </w:trPr>
+        <w:tc>
+          <w:tcPr>
+            <w:tcW w:w="2109" w:type="dxa"/>
+          </w:tcPr>
+          <w:p>
+            <w:pPr>
+              <w:spacing w:before="40" w:after="40"/>
+            </w:pPr>
+            <w:r>
+              <w:rPr>
+                <w:sz w:val="20"/>
+              </w:rPr>
+              <w:t>CSS custom properties / themes</w:t>
+            </w:r>
+          </w:p>
+        </w:tc>
+        <w:tc>
+          <w:tcPr>
+            <w:tcW w:w="3057" w:type="dxa"/>
+          </w:tcPr>
+          <w:p>
+            <w:pPr>
+              <w:spacing w:before="40" w:after="40"/>
+              <w:rPr>
+                <w:sz w:val="20"/>
+              </w:rPr>
+            </w:pPr>
+            <w:r>
+              <w:rPr>
+                <w:sz w:val="20"/>
+              </w:rPr>
+              <w:t xml:space="preserve">:root tokens for </w:t>
+            </w:r>
+            <w:proofErr w:type="spellStart"/>
+            <w:r>
+              <w:rPr>
+                <w:sz w:val="20"/>
+              </w:rPr>
+              <w:t>colour</w:t>
+            </w:r>
+            <w:proofErr w:type="spellEnd"/>
+            <w:r>
+              <w:rPr>
+                <w:sz w:val="20"/>
+              </w:rPr>
+              <w:t>, space, type</w:t>
+            </w:r>
+          </w:p>
+          <w:p>
+            <w:pPr>
+              <w:spacing w:before="40" w:after="40"/>
+              <w:rPr>
+                <w:sz w:val="20"/>
+              </w:rPr>
+            </w:pPr>
+          </w:p>
+          <w:p>
+            <w:pPr>
+              <w:spacing w:before="40" w:after="40"/>
+            </w:pPr>
+          </w:p>
+        </w:tc>
+        <w:tc>
+          <w:tcPr>
+            <w:tcW w:w="3402" w:type="dxa"/>
+          </w:tcPr>
+          <w:p>
+            <w:pPr>
+              <w:spacing w:before="40" w:after="40"/>
+              <w:rPr>
+                <w:lang w:val="en-NZ"/>
+              </w:rPr>
+            </w:pPr>
+            <w:r>
+              <w:rPr>
+                <w:lang w:val="en-NZ"/>
+              </w:rPr>
+              <w:t>:root {</w:t>
+            </w:r>
+          </w:p>
+          <w:p>
+            <w:pPr>
+              <w:spacing w:before="40" w:after="40"/>
+              <w:rPr>
+                <w:lang w:val="en-NZ"/>
+              </w:rPr>
+            </w:pPr>
+            <w:r>
+              <w:rPr>
+                <w:lang w:val="en-NZ"/>
+              </w:rPr>
+              <w:t xml:space="preserve">    --brown: #7B5132;</w:t>
+            </w:r>
+          </w:p>
+          <w:p>
+            <w:pPr>
+              <w:spacing w:before="40" w:after="40"/>
+              <w:rPr>
+                <w:lang w:val="en-NZ"/>
+              </w:rPr>
+            </w:pPr>
+            <w:r>
+              <w:rPr>
+                <w:lang w:val="en-NZ"/>
+              </w:rPr>
+              <w:t xml:space="preserve">    --apricot: #D98452;</w:t>
+            </w:r>
+          </w:p>
+          <w:p>
+            <w:pPr>
+              <w:spacing w:before="40" w:after="40"/>
+              <w:rPr>
+                <w:lang w:val="en-NZ"/>
+              </w:rPr>
+            </w:pPr>
+            <w:r>
+              <w:rPr>
+                <w:lang w:val="en-NZ"/>
+              </w:rPr>
+              <w:t xml:space="preserve">    --beige: #FFC67E;</w:t>
+            </w:r>
+          </w:p>
+          <w:p>
+            <w:pPr>
+              <w:spacing w:before="40" w:after="40"/>
+              <w:rPr>
+                <w:lang w:val="en-NZ"/>
+              </w:rPr>
+            </w:pPr>
+            <w:r>
+              <w:rPr>
+                <w:lang w:val="en-NZ"/>
+              </w:rPr>
+              <w:t xml:space="preserve">    --off-white: #FFEEC7;</w:t>
+            </w:r>
+          </w:p>
+          <w:p>
+            <w:pPr>
+              <w:spacing w:before="40" w:after="40"/>
+              <w:rPr>
+                <w:lang w:val="en-NZ"/>
+              </w:rPr>
+            </w:pPr>
+            <w:r>
+              <w:rPr>
+                <w:lang w:val="en-NZ"/>
+              </w:rPr>
+              <w:t>}</w:t>
+            </w:r>
+          </w:p>
+          <w:p>
+            <w:pPr>
+              <w:spacing w:before="40" w:after="40"/>
+              <w:rPr>
+                <w:lang w:val="en-NZ"/>
+              </w:rPr>
+            </w:pPr>
+          </w:p>
+          <w:p>
+            <w:pPr>
+              <w:spacing w:before="40" w:after="40"/>
+              <w:rPr>
+                <w:lang w:val="en-NZ"/>
+              </w:rPr>
+            </w:pPr>
+            <w:r>
+              <w:rPr>
+                <w:lang w:val="en-NZ"/>
+              </w:rPr>
+              <w:t xml:space="preserve"> I use CSS custom properties in the :root selector to define reusable colours and other design values. These variables are used throughout the interface to maintain a consistent visual style and make the design easier to modify.</w:t>
+            </w:r>
+          </w:p>
+          <w:p>
+            <w:pPr>
+              <w:spacing w:before="40" w:after="40"/>
+            </w:pPr>
+          </w:p>
+          <w:p>
+            <w:pPr>
+              <w:spacing w:before="40" w:after="40"/>
+            </w:pPr>
+            <w:r>
+              <w:rPr>
+                <w:noProof/>
+              </w:rPr>
+              <w:drawing>
+                <wp:anchor distT="0" distB="0" distL="114300" distR="114300" simplePos="0" relativeHeight="251958272" behindDoc="0" locked="0" layoutInCell="1" allowOverlap="1" wp14:anchorId="63561203" wp14:editId="4D07CEA0">
+                  <wp:simplePos x="0" y="0"/>
+                  <wp:positionH relativeFrom="column">
+                    <wp:posOffset>27794</wp:posOffset>
+                  </wp:positionH>
+                  <wp:positionV relativeFrom="paragraph">
+                    <wp:posOffset>12268</wp:posOffset>
+                  </wp:positionV>
+                  <wp:extent cx="1471930" cy="984885"/>
+                  <wp:effectExtent l="0" t="0" r="0" b="5715"/>
+                  <wp:wrapSquare wrapText="bothSides"/>
+                  <wp:docPr id="751860783" name="Picture 1"/>
+                  <wp:cNvGraphicFramePr>
+                    <a:graphicFrameLocks xmlns:a="http://schemas.openxmlformats.org/drawingml/2006/main" noChangeAspect="1"/>
+                  </wp:cNvGraphicFramePr>
+                  <a:graphic xmlns:a="http://schemas.openxmlformats.org/drawingml/2006/main">
+                    <a:graphicData uri="http://schemas.openxmlformats.org/drawingml/2006/picture">
+                      <pic:pic xmlns:pic="http://schemas.openxmlformats.org/drawingml/2006/picture">
+                        <pic:nvPicPr>
+                          <pic:cNvPr id="751860783" name=""/>
+                          <pic:cNvPicPr/>
+                        </pic:nvPicPr>
+                        <pic:blipFill>
+                          <a:blip r:embed="rId13"/>
+                          <a:stretch>
+                            <a:fillRect/>
+                          </a:stretch>
+                        </pic:blipFill>
+                        <pic:spPr>
+                          <a:xfrm>
+                            <a:off x="0" y="0"/>
+                            <a:ext cx="1471930" cy="984885"/>
+                          </a:xfrm>
+                          <a:prstGeom prst="rect">
+                            <a:avLst/>
+                          </a:prstGeom>
+                        </pic:spPr>
+                      </pic:pic>
+                    </a:graphicData>
+                  </a:graphic>
+                  <wp14:sizeRelH relativeFrom="margin">
+                    <wp14:pctWidth>0</wp14:pctWidth>
+                  </wp14:sizeRelH>
+                  <wp14:sizeRelV relativeFrom="margin">
+                    <wp14:pctHeight>0</wp14:pctHeight>
+                  </wp14:sizeRelV>
+                </wp:anchor>
+              </w:drawing>
+            </w:r>
+          </w:p>
+          <w:p>
+            <w:pPr>
+              <w:spacing w:before="40" w:after="40"/>
+            </w:pPr>
+            <w:r>
+              <w:rPr>
+                <w:noProof/>
+              </w:rPr>
+              <w:drawing>
+                <wp:anchor distT="0" distB="0" distL="114300" distR="114300" simplePos="0" relativeHeight="251959296" behindDoc="0" locked="0" layoutInCell="1" allowOverlap="1" wp14:anchorId="20B93299" wp14:editId="50C5111A">
+                  <wp:simplePos x="0" y="0"/>
+                  <wp:positionH relativeFrom="column">
+                    <wp:posOffset>-14117</wp:posOffset>
+                  </wp:positionH>
+                  <wp:positionV relativeFrom="paragraph">
+                    <wp:posOffset>932941</wp:posOffset>
+                  </wp:positionV>
+                  <wp:extent cx="1517015" cy="716280"/>
+                  <wp:effectExtent l="0" t="0" r="6985" b="7620"/>
+                  <wp:wrapSquare wrapText="bothSides"/>
+                  <wp:docPr id="281800322" name="Picture 1"/>
+                  <wp:cNvGraphicFramePr>
+                    <a:graphicFrameLocks xmlns:a="http://schemas.openxmlformats.org/drawingml/2006/main" noChangeAspect="1"/>
+                  </wp:cNvGraphicFramePr>
+                  <a:graphic xmlns:a="http://schemas.openxmlformats.org/drawingml/2006/main">
+                    <a:graphicData uri="http://schemas.openxmlformats.org/drawingml/2006/picture">
+                      <pic:pic xmlns:pic="http://schemas.openxmlformats.org/drawingml/2006/picture">
+                        <pic:nvPicPr>
+                          <pic:cNvPr id="281800322" name=""/>
+                          <pic:cNvPicPr/>
+                        </pic:nvPicPr>
+                        <pic:blipFill>
+                          <a:blip r:embed="rId14"/>
+                          <a:stretch>
+                            <a:fillRect/>
+                          </a:stretch>
+                        </pic:blipFill>
+                        <pic:spPr>
+                          <a:xfrm>
+                            <a:off x="0" y="0"/>
+                            <a:ext cx="1517015" cy="716280"/>
+                          </a:xfrm>
+                          <a:prstGeom prst="rect">
+                            <a:avLst/>
+                          </a:prstGeom>
+                        </pic:spPr>
+                      </pic:pic>
+                    </a:graphicData>
+                  </a:graphic>
+                  <wp14:sizeRelH relativeFrom="margin">
+                    <wp14:pctWidth>0</wp14:pctWidth>
+                  </wp14:sizeRelH>
+                  <wp14:sizeRelV relativeFrom="margin">
+                    <wp14:pctHeight>0</wp14:pctHeight>
+                  </wp14:sizeRelV>
+                </wp:anchor>
+              </w:drawing>
+            </w:r>
+          </w:p>
+        </w:tc>
+      </w:tr>
+      <w:tr>
+        <w:trPr>
+          <w:jc w:val="center"/>
+        </w:trPr>
+        <w:tc>
+          <w:tcPr>
+            <w:tcW w:w="2109" w:type="dxa"/>
+            <w:shd w:val="clear" w:color="auto" w:fill="F0F4F8"/>
+          </w:tcPr>
+          <w:p>
+            <w:pPr>
+              <w:spacing w:before="40" w:after="40"/>
+            </w:pPr>
+            <w:r>
+              <w:rPr>
+                <w:sz w:val="20"/>
+              </w:rPr>
+              <w:lastRenderedPageBreak/>
+              <w:t>Responsive layout system</w:t>
+            </w:r>
+          </w:p>
+        </w:tc>
+        <w:tc>
+          <w:tcPr>
+            <w:tcW w:w="3057" w:type="dxa"/>
+            <w:shd w:val="clear" w:color="auto" w:fill="F0F4F8"/>
+          </w:tcPr>
+          <w:p>
+            <w:pPr>
+              <w:spacing w:before="40" w:after="40"/>
+            </w:pPr>
+            <w:r>
+              <w:rPr>
+                <w:sz w:val="20"/>
+              </w:rPr>
+              <w:t>Mobile-first flex/grid + breakpoints</w:t>
+            </w:r>
+            <w:r>
+              <w:rPr>
+                <w:sz w:val="20"/>
+              </w:rPr>
+              <w:br/>
+            </w:r>
+            <w:r>
+              <w:rPr>
+                <w:sz w:val="20"/>
+              </w:rPr>
+              <w:br/>
+            </w:r>
+            <w:r>
+              <w:t>I will use flexbox/ grid and media queries to make the interface adapt to the screen size.</w:t>
+            </w:r>
+          </w:p>
+        </w:tc>
+        <w:tc>
+          <w:tcPr>
+            <w:tcW w:w="3402" w:type="dxa"/>
+            <w:shd w:val="clear" w:color="auto" w:fill="F0F4F8"/>
+          </w:tcPr>
+          <w:p>
+            <w:pPr>
+              <w:spacing w:before="40" w:after="40"/>
+            </w:pPr>
+          </w:p>
+          <w:p>
+            <w:pPr>
+              <w:spacing w:before="40" w:after="40"/>
+              <w:rPr>
+                <w:lang w:val="en-NZ"/>
+              </w:rPr>
+            </w:pPr>
+            <w:r>
+              <w:rPr>
+                <w:lang w:val="en-NZ"/>
+              </w:rPr>
+              <w:t xml:space="preserve"> I use Flexbox/Grid and media queries to create a responsive interface that adapts to different screen sizes. This allows the dashboard, navigation and content cards to rearrange appropriately on mobile and larger screens, making the outcome usable across different devices.</w:t>
+            </w:r>
+          </w:p>
+          <w:p>
+            <w:pPr>
+              <w:spacing w:before="40" w:after="40"/>
+            </w:pPr>
+            <w:r>
+              <w:rPr>
+                <w:noProof/>
+              </w:rPr>
+              <w:drawing>
+                <wp:anchor distT="0" distB="0" distL="114300" distR="114300" simplePos="0" relativeHeight="251960320" behindDoc="0" locked="0" layoutInCell="1" allowOverlap="1" wp14:anchorId="7066CA02" wp14:editId="39A5C4D9">
+                  <wp:simplePos x="0" y="0"/>
+                  <wp:positionH relativeFrom="column">
+                    <wp:posOffset>-64905</wp:posOffset>
+                  </wp:positionH>
+                  <wp:positionV relativeFrom="paragraph">
+                    <wp:posOffset>6485</wp:posOffset>
+                  </wp:positionV>
+                  <wp:extent cx="2023110" cy="624205"/>
+                  <wp:effectExtent l="0" t="0" r="0" b="4445"/>
+                  <wp:wrapSquare wrapText="bothSides"/>
+                  <wp:docPr id="1101011646" name="Picture 1"/>
+                  <wp:cNvGraphicFramePr>
+                    <a:graphicFrameLocks xmlns:a="http://schemas.openxmlformats.org/drawingml/2006/main" noChangeAspect="1"/>
+                  </wp:cNvGraphicFramePr>
+                  <a:graphic xmlns:a="http://schemas.openxmlformats.org/drawingml/2006/main">
+                    <a:graphicData uri="http://schemas.openxmlformats.org/drawingml/2006/picture">
+                      <pic:pic xmlns:pic="http://schemas.openxmlformats.org/drawingml/2006/picture">
+                        <pic:nvPicPr>
+                          <pic:cNvPr id="1101011646" name=""/>
+                          <pic:cNvPicPr/>
+                        </pic:nvPicPr>
+                        <pic:blipFill>
+                          <a:blip r:embed="rId15"/>
+                          <a:stretch>
+                            <a:fillRect/>
+                          </a:stretch>
+                        </pic:blipFill>
+                        <pic:spPr>
+                          <a:xfrm>
+                            <a:off x="0" y="0"/>
+                            <a:ext cx="2023110" cy="624205"/>
+                          </a:xfrm>
+                          <a:prstGeom prst="rect">
+                            <a:avLst/>
+                          </a:prstGeom>
+                        </pic:spPr>
+                      </pic:pic>
+                    </a:graphicData>
+                  </a:graphic>
+                  <wp14:sizeRelH relativeFrom="margin">
+                    <wp14:pctWidth>0</wp14:pctWidth>
+                  </wp14:sizeRelH>
+                  <wp14:sizeRelV relativeFrom="margin">
+                    <wp14:pctHeight>0</wp14:pctHeight>
+                  </wp14:sizeRelV>
+                </wp:anchor>
+              </w:drawing>
+            </w:r>
+          </w:p>
+        </w:tc>
+      </w:tr>
+      <w:tr>
+        <w:trPr>
+          <w:jc w:val="center"/>
+        </w:trPr>
+        <w:tc>
+          <w:tcPr>
+            <w:tcW w:w="2109" w:type="dxa"/>
+          </w:tcPr>
+          <w:p>
+            <w:pPr>
+              <w:spacing w:before="40" w:after="40"/>
+            </w:pPr>
+            <w:r>
+              <w:rPr>
+                <w:sz w:val="20"/>
+              </w:rPr>
+              <w:t>Reusable UI pattern</w:t>
+            </w:r>
+          </w:p>
+        </w:tc>
+        <w:tc>
+          <w:tcPr>
+            <w:tcW w:w="3057" w:type="dxa"/>
+          </w:tcPr>
+          <w:p>
+            <w:pPr>
+              <w:spacing w:before="40" w:after="40"/>
+            </w:pPr>
+            <w:r>
+              <w:rPr>
+                <w:sz w:val="20"/>
+              </w:rPr>
+              <w:t>Shared card/component classes or partials</w:t>
+            </w:r>
+          </w:p>
+        </w:tc>
+        <w:tc>
+          <w:tcPr>
+            <w:tcW w:w="3402" w:type="dxa"/>
+          </w:tcPr>
+          <w:p>
+            <w:pPr>
+              <w:spacing w:before="40" w:after="40"/>
+            </w:pPr>
+          </w:p>
+        </w:tc>
+      </w:tr>
+      <w:tr>
+        <w:trPr>
+          <w:jc w:val="center"/>
+        </w:trPr>
+        <w:tc>
+          <w:tcPr>
+            <w:tcW w:w="2109" w:type="dxa"/>
+            <w:shd w:val="clear" w:color="auto" w:fill="F0F4F8"/>
+          </w:tcPr>
+          <w:p>
+            <w:pPr>
+              <w:spacing w:before="40" w:after="40"/>
+            </w:pPr>
+            <w:r>
+              <w:rPr>
+                <w:sz w:val="20"/>
+              </w:rPr>
+              <w:t>Data-driven content</w:t>
+            </w:r>
+          </w:p>
+        </w:tc>
+        <w:tc>
+          <w:tcPr>
+            <w:tcW w:w="3057" w:type="dxa"/>
+            <w:shd w:val="clear" w:color="auto" w:fill="F0F4F8"/>
+          </w:tcPr>
+          <w:p>
+            <w:pPr>
+              <w:spacing w:before="40" w:after="40"/>
+            </w:pPr>
+            <w:r>
+              <w:rPr>
+                <w:sz w:val="20"/>
+              </w:rPr>
+              <w:t>JSON/CSV mapped to visible UI</w:t>
+            </w:r>
+          </w:p>
+        </w:tc>
+        <w:tc>
+          <w:tcPr>
+            <w:tcW w:w="3402" w:type="dxa"/>
+            <w:shd w:val="clear" w:color="auto" w:fill="F0F4F8"/>
+          </w:tcPr>
+          <w:p>
+            <w:pPr>
+              <w:spacing w:before="40" w:after="40"/>
+            </w:pPr>
+            <w:r>
+              <w:t xml:space="preserve">Json and </w:t>
+            </w:r>
+            <w:proofErr w:type="spellStart"/>
+            <w:r>
+              <w:t>localstorage</w:t>
+            </w:r>
+            <w:proofErr w:type="spellEnd"/>
+            <w:r>
+              <w:t xml:space="preserve"> to save users thesis parts. The data will be accessible in the users ‘saved theses’ box on the home page of the dashboard. </w:t>
+            </w:r>
+            <w:r>
+              <w:br/>
+              <w:t xml:space="preserve"> </w:t>
+            </w:r>
+          </w:p>
+          <w:p>
+            <w:pPr>
+              <w:spacing w:before="40" w:after="40"/>
+            </w:pPr>
+            <w:r>
+              <w:t>When clicked on in the saved theses section, saved thesis data populates a form showing all the information that was entered previously, organized neatly.</w:t>
+            </w:r>
+          </w:p>
+          <w:p>
+            <w:pPr>
+              <w:spacing w:before="40" w:after="40"/>
+            </w:pPr>
+            <w:r>
+              <w:rPr>
+                <w:noProof/>
+              </w:rPr>
+              <w:drawing>
+                <wp:anchor distT="0" distB="0" distL="114300" distR="114300" simplePos="0" relativeHeight="251962368" behindDoc="0" locked="0" layoutInCell="1" allowOverlap="1" wp14:anchorId="3D162DA9" wp14:editId="7D555DE2">
+                  <wp:simplePos x="0" y="0"/>
+                  <wp:positionH relativeFrom="column">
+                    <wp:posOffset>-65315</wp:posOffset>
+                  </wp:positionH>
+                  <wp:positionV relativeFrom="paragraph">
+                    <wp:posOffset>274682</wp:posOffset>
+                  </wp:positionV>
+                  <wp:extent cx="2864304" cy="658604"/>
+                  <wp:effectExtent l="0" t="0" r="0" b="8255"/>
+                  <wp:wrapSquare wrapText="bothSides"/>
+                  <wp:docPr id="400196166" name="Picture 1"/>
+                  <wp:cNvGraphicFramePr>
+                    <a:graphicFrameLocks xmlns:a="http://schemas.openxmlformats.org/drawingml/2006/main" noChangeAspect="1"/>
+                  </wp:cNvGraphicFramePr>
+                  <a:graphic xmlns:a="http://schemas.openxmlformats.org/drawingml/2006/main">
+                    <a:graphicData uri="http://schemas.openxmlformats.org/drawingml/2006/picture">
+                      <pic:pic xmlns:pic="http://schemas.openxmlformats.org/drawingml/2006/picture">
+                        <pic:nvPicPr>
+                          <pic:cNvPr id="400196166" name=""/>
+                          <pic:cNvPicPr/>
+                        </pic:nvPicPr>
+                        <pic:blipFill>
+                          <a:blip r:embed="rId16"/>
+                          <a:stretch>
+                            <a:fillRect/>
+                          </a:stretch>
+                        </pic:blipFill>
+                        <pic:spPr>
+                          <a:xfrm>
+                            <a:off x="0" y="0"/>
+                            <a:ext cx="2864304" cy="658604"/>
+                          </a:xfrm>
+                          <a:prstGeom prst="rect">
+                            <a:avLst/>
+                          </a:prstGeom>
+                        </pic:spPr>
+                      </pic:pic>
+                    </a:graphicData>
+                  </a:graphic>
+                  <wp14:sizeRelH relativeFrom="margin">
+                    <wp14:pctWidth>0</wp14:pctWidth>
+                  </wp14:sizeRelH>
+                  <wp14:sizeRelV relativeFrom="margin">
+                    <wp14:pctHeight>0</wp14:pctHeight>
+                  </wp14:sizeRelV>
+                </wp:anchor>
+              </w:drawing>
+            </w:r>
+          </w:p>
+          <w:p>
+            <w:pPr>
+              <w:spacing w:before="40" w:after="40"/>
+            </w:pPr>
+          </w:p>
+        </w:tc>
+      </w:tr>
+      <w:tr>
+        <w:trPr>
+          <w:jc w:val="center"/>
+        </w:trPr>
+        <w:tc>
+          <w:tcPr>
+            <w:tcW w:w="2109" w:type="dxa"/>
+          </w:tcPr>
+          <w:p>
+            <w:pPr>
+              <w:spacing w:before="40" w:after="40"/>
+            </w:pPr>
+            <w:r>
+              <w:rPr>
+                <w:sz w:val="20"/>
+              </w:rPr>
+              <w:t>Scripts / interactivity</w:t>
+            </w:r>
+          </w:p>
+        </w:tc>
+        <w:tc>
+          <w:tcPr>
+            <w:tcW w:w="3057" w:type="dxa"/>
+          </w:tcPr>
+          <w:p>
+            <w:pPr>
+              <w:spacing w:before="40" w:after="40"/>
+            </w:pPr>
+            <w:r>
+              <w:rPr>
+                <w:sz w:val="20"/>
+              </w:rPr>
+              <w:t>Custom JS for filters, tabs, states</w:t>
+            </w:r>
+          </w:p>
+        </w:tc>
+        <w:tc>
+          <w:tcPr>
+            <w:tcW w:w="3402" w:type="dxa"/>
+          </w:tcPr>
+          <w:p>
+            <w:pPr>
+              <w:spacing w:before="40" w:after="40"/>
+            </w:pPr>
+          </w:p>
+        </w:tc>
+      </w:tr>
+      <w:tr>
+        <w:trPr>
+          <w:jc w:val="center"/>
+        </w:trPr>
+        <w:tc>
+          <w:tcPr>
+            <w:tcW w:w="2109" w:type="dxa"/>
+            <w:shd w:val="clear" w:color="auto" w:fill="F0F4F8"/>
+          </w:tcPr>
+          <w:p>
+            <w:pPr>
+              <w:spacing w:before="40" w:after="40"/>
+            </w:pPr>
+            <w:r>
+              <w:rPr>
+                <w:sz w:val="20"/>
+              </w:rPr>
+              <w:t>Third-party library</w:t>
+            </w:r>
+          </w:p>
+        </w:tc>
+        <w:tc>
+          <w:tcPr>
+            <w:tcW w:w="3057" w:type="dxa"/>
+            <w:shd w:val="clear" w:color="auto" w:fill="F0F4F8"/>
+          </w:tcPr>
+          <w:p>
+            <w:pPr>
+              <w:spacing w:before="40" w:after="40"/>
+            </w:pPr>
+            <w:r>
+              <w:rPr>
+                <w:sz w:val="20"/>
+              </w:rPr>
+              <w:t>Charts, icons, UI kit used with understanding</w:t>
+            </w:r>
+          </w:p>
+        </w:tc>
+        <w:tc>
+          <w:tcPr>
+            <w:tcW w:w="3402" w:type="dxa"/>
+            <w:shd w:val="clear" w:color="auto" w:fill="F0F4F8"/>
+          </w:tcPr>
+          <w:p>
+            <w:pPr>
+              <w:spacing w:before="40" w:after="40"/>
+            </w:pPr>
+          </w:p>
+        </w:tc>
+      </w:tr>
+      <w:tr>
+        <w:trPr>
+          <w:jc w:val="center"/>
+        </w:trPr>
+        <w:tc>
+          <w:tcPr>
+            <w:tcW w:w="2109" w:type="dxa"/>
+          </w:tcPr>
+          <w:p>
+            <w:pPr>
+              <w:spacing w:before="40" w:after="40"/>
+            </w:pPr>
+            <w:r>
+              <w:rPr>
+                <w:sz w:val="20"/>
+              </w:rPr>
+              <w:t xml:space="preserve">Asset pipeline / </w:t>
+            </w:r>
+            <w:proofErr w:type="spellStart"/>
+            <w:r>
+              <w:rPr>
+                <w:sz w:val="20"/>
+              </w:rPr>
+              <w:t>optimisation</w:t>
+            </w:r>
+            <w:proofErr w:type="spellEnd"/>
+          </w:p>
+        </w:tc>
+        <w:tc>
+          <w:tcPr>
+            <w:tcW w:w="3057" w:type="dxa"/>
+          </w:tcPr>
+          <w:p>
+            <w:pPr>
+              <w:spacing w:before="40" w:after="40"/>
+            </w:pPr>
+            <w:r>
+              <w:rPr>
+                <w:sz w:val="20"/>
+              </w:rPr>
+              <w:t>Compressed images, sprites, consistent paths</w:t>
+            </w:r>
+          </w:p>
+        </w:tc>
+        <w:tc>
+          <w:tcPr>
+            <w:tcW w:w="3402" w:type="dxa"/>
+          </w:tcPr>
+          <w:p>
+            <w:pPr>
+              <w:spacing w:before="40" w:after="40"/>
+            </w:pPr>
+          </w:p>
+        </w:tc>
+      </w:tr>
+    </w:tbl>
+    <w:p/>
+    <w:p>
+      <w:pPr>
+        <w:spacing w:after="40"/>
+        <w:rPr>
+          <w:u w:val="single"/>
+        </w:rPr>
+      </w:pPr>
+      <w:r>
+        <w:rPr>
+          <w:b/>
+          <w:highlight w:val="yellow"/>
+          <w:u w:val="single"/>
+        </w:rPr>
+        <w:t>Gaps I still need to add:</w:t>
+      </w:r>
+    </w:p>
+    <w:p>
+      <w:pPr>
+        <w:pStyle w:val="ListParagraph"/>
+        <w:numPr>
+          <w:ilvl w:val="0"/>
+          <w:numId w:val="2"/>
+        </w:numPr>
+        <w:spacing w:after="40"/>
+        <w:rPr>
+          <w:color w:val="AAAAAA"/>
+          <w:sz w:val="20"/>
+        </w:rPr>
+      </w:pPr>
+    </w:p>
+    <w:p>
+      <w:pPr>
+        <w:spacing w:after="40"/>
+        <w:rPr>
+          <w:b/>
+          <w:u w:val="single"/>
+        </w:rPr>
+      </w:pPr>
+      <w:r>
+        <w:rPr>
+          <w:b/>
+          <w:highlight w:val="yellow"/>
+          <w:u w:val="single"/>
+        </w:rPr>
+        <w:t>My ≥2 techniques for assessment:</w:t>
+      </w:r>
+    </w:p>
+    <w:p>
+      <w:pPr>
+        <w:pStyle w:val="ListParagraph"/>
+        <w:numPr>
+          <w:ilvl w:val="0"/>
+          <w:numId w:val="2"/>
+        </w:numPr>
+        <w:spacing w:after="40"/>
+      </w:pPr>
+      <w:r>
+        <w:t>I am going</w:t>
+      </w:r>
+      <w:r>
+        <w:t xml:space="preserve"> to use a JSON file to track users investment thesis and options. I have chosen this because it allows me to record a lot of data, for different users and populate more than one html file with this data. I also like how easy it is to save things to it from my previous assessment.</w:t>
+      </w:r>
+    </w:p>
+    <w:p>
+      <w:pPr>
+        <w:pStyle w:val="ListParagraph"/>
+        <w:numPr>
+          <w:ilvl w:val="0"/>
+          <w:numId w:val="2"/>
+        </w:numPr>
+        <w:spacing w:after="40"/>
+      </w:pPr>
+      <w:r>
+        <w:lastRenderedPageBreak/>
+        <w:t xml:space="preserve">Responsive system layout using flexbox / grid to ensure my interface can be used on mobile devices and larger screens. This makes it more accessible to a greater amount of users, and especially casual investors which is most people. </w:t>
+      </w:r>
+    </w:p>
+    <w:p/>
     <w:p>
       <w:pPr>
         <w:rPr>
@@ -1896,7 +2010,6 @@
           <w:sz w:val="28"/>
           <w:szCs w:val="28"/>
           <w:u w:val="single"/>
-          <w:lang w:val="fr-FR"/>
         </w:rPr>
       </w:pPr>
       <w:r>
@@ -1927,7 +2040,7 @@
                     <pic:cNvPicPr/>
                   </pic:nvPicPr>
                   <pic:blipFill>
-                    <a:blip r:embed="rId15"/>
+                    <a:blip r:embed="rId17"/>
                     <a:stretch>
                       <a:fillRect/>
                     </a:stretch>
@@ -1981,7 +2094,7 @@
                     <pic:cNvPicPr/>
                   </pic:nvPicPr>
                   <pic:blipFill>
-                    <a:blip r:embed="rId16" cstate="print">
+                    <a:blip r:embed="rId18" cstate="print">
                       <a:extLst>
                         <a:ext uri="{28A0092B-C50C-407E-A947-70E740481C1C}">
                           <a14:useLocalDpi xmlns:a14="http://schemas.microsoft.com/office/drawing/2010/main" val="0"/>
@@ -2041,7 +2154,7 @@
                     <pic:cNvPicPr/>
                   </pic:nvPicPr>
                   <pic:blipFill>
-                    <a:blip r:embed="rId17" cstate="print">
+                    <a:blip r:embed="rId19" cstate="print">
                       <a:extLst>
                         <a:ext uri="{28A0092B-C50C-407E-A947-70E740481C1C}">
                           <a14:useLocalDpi xmlns:a14="http://schemas.microsoft.com/office/drawing/2010/main" val="0"/>
@@ -2073,7 +2186,6 @@
           </wp:anchor>
         </w:drawing>
       </w:r>
-      <w:proofErr w:type="spellStart"/>
       <w:r>
         <w:rPr>
           <w:b/>
@@ -2082,22 +2194,8 @@
           <w:szCs w:val="28"/>
           <w:highlight w:val="yellow"/>
           <w:u w:val="single"/>
-          <w:lang w:val="fr-FR"/>
-        </w:rPr>
-        <w:t>Colour</w:t>
-      </w:r>
-      <w:proofErr w:type="spellEnd"/>
-      <w:r>
-        <w:rPr>
-          <w:b/>
-          <w:bCs/>
-          <w:sz w:val="28"/>
-          <w:szCs w:val="28"/>
-          <w:highlight w:val="yellow"/>
-          <w:u w:val="single"/>
-          <w:lang w:val="fr-FR"/>
-        </w:rPr>
-        <w:t xml:space="preserve"> palette testing:</w:t>
+        </w:rPr>
+        <w:t>Colour palette testing:</w:t>
       </w:r>
     </w:p>
     <w:p>
@@ -2108,7 +2206,6 @@
           <w:sz w:val="28"/>
           <w:szCs w:val="28"/>
           <w:u w:val="single"/>
-          <w:lang w:val="fr-FR"/>
         </w:rPr>
       </w:pPr>
     </w:p>
@@ -2117,7 +2214,6 @@
         <w:rPr>
           <w:sz w:val="28"/>
           <w:szCs w:val="28"/>
-          <w:lang w:val="fr-FR"/>
         </w:rPr>
       </w:pPr>
       <w:r>
@@ -2148,7 +2244,7 @@
                     <pic:cNvPicPr/>
                   </pic:nvPicPr>
                   <pic:blipFill>
-                    <a:blip r:embed="rId18" cstate="print">
+                    <a:blip r:embed="rId20" cstate="print">
                       <a:extLst>
                         <a:ext uri="{28A0092B-C50C-407E-A947-70E740481C1C}">
                           <a14:useLocalDpi xmlns:a14="http://schemas.microsoft.com/office/drawing/2010/main" val="0"/>
@@ -2214,7 +2310,7 @@
                     <pic:cNvPicPr/>
                   </pic:nvPicPr>
                   <pic:blipFill>
-                    <a:blip r:embed="rId19"/>
+                    <a:blip r:embed="rId21"/>
                     <a:stretch>
                       <a:fillRect/>
                     </a:stretch>
@@ -2246,7 +2342,6 @@
         <w:pStyle w:val="Heading1"/>
         <w:rPr>
           <w:color w:val="1A3A5C"/>
-          <w:lang w:val="fr-FR"/>
         </w:rPr>
       </w:pPr>
     </w:p>
@@ -2255,7 +2350,6 @@
         <w:pStyle w:val="Heading1"/>
         <w:rPr>
           <w:color w:val="1A3A5C"/>
-          <w:lang w:val="fr-FR"/>
         </w:rPr>
       </w:pPr>
     </w:p>
@@ -2264,7 +2358,6 @@
         <w:pStyle w:val="Heading1"/>
         <w:rPr>
           <w:color w:val="1A3A5C"/>
-          <w:lang w:val="fr-FR"/>
         </w:rPr>
       </w:pPr>
     </w:p>
@@ -2288,11 +2381,7 @@
         <w:t xml:space="preserve">off-white-brown </w:t>
       </w:r>
       <w:r>
-        <w:t xml:space="preserve">colour palette the best, and also think </w:t>
-      </w:r>
-      <w:r>
-        <w:lastRenderedPageBreak/>
-        <w:t>that it looks the most suitable for the topic of my website. The colour palette needs to be mature</w:t>
+        <w:t>colour palette the best, and also think that it looks the most suitable for the topic of my website. The colour palette needs to be mature</w:t>
       </w:r>
       <w:r>
         <w:t>, because people may be using my journal to decide where thousands of their own dollars go, the pink would make it feel too game-</w:t>
@@ -2347,6 +2436,7 @@
     </w:p>
     <w:p>
       <w:r>
+        <w:lastRenderedPageBreak/>
         <w:t>Specification:</w:t>
       </w:r>
     </w:p>
@@ -2372,7 +2462,7 @@
           <w:u w:val="single"/>
         </w:rPr>
       </w:pPr>
-      <w:hyperlink r:id="rId20" w:history="1">
+      <w:hyperlink r:id="rId22" w:history="1">
         <w:r>
           <w:rPr>
             <w:rStyle w:val="Hyperlink"/>
@@ -2439,7 +2529,7 @@
                     <pic:cNvPicPr/>
                   </pic:nvPicPr>
                   <pic:blipFill>
-                    <a:blip r:embed="rId21" cstate="print">
+                    <a:blip r:embed="rId23" cstate="print">
                       <a:extLst>
                         <a:ext uri="{28A0092B-C50C-407E-A947-70E740481C1C}">
                           <a14:useLocalDpi xmlns:a14="http://schemas.microsoft.com/office/drawing/2010/main" val="0"/>
@@ -2507,7 +2597,7 @@
                     <pic:cNvPicPr/>
                   </pic:nvPicPr>
                   <pic:blipFill>
-                    <a:blip r:embed="rId22" cstate="print">
+                    <a:blip r:embed="rId24" cstate="print">
                       <a:extLst>
                         <a:ext uri="{28A0092B-C50C-407E-A947-70E740481C1C}">
                           <a14:useLocalDpi xmlns:a14="http://schemas.microsoft.com/office/drawing/2010/main" val="0"/>
@@ -2542,11 +2632,7 @@
         <w:t>letter design feels more modern, sensation looks closer to a type writer</w:t>
       </w:r>
       <w:r>
-        <w:t xml:space="preserve">. I also think that it looks a bit more rigid, the </w:t>
-      </w:r>
-      <w:r>
-        <w:lastRenderedPageBreak/>
-        <w:t>sensation letters are very square and that’s not what I want for a welcoming page. More rounded fonts make the user experience more inviting.</w:t>
+        <w:t>. I also think that it looks a bit more rigid, the sensation letters are very square and that’s not what I want for a welcoming page. More rounded fonts make the user experience more inviting.</w:t>
       </w:r>
     </w:p>
     <w:p/>
@@ -2579,7 +2665,6 @@
         <w:t xml:space="preserve">aesthetic feedback reported that users liked it the most. I also like it too. </w:t>
       </w:r>
     </w:p>
-    <w:p/>
     <w:p/>
     <w:p/>
     <w:p/>
@@ -2829,7 +2914,6 @@
                 <w:noProof/>
                 <w:color w:val="171717" w:themeColor="background2" w:themeShade="1A"/>
               </w:rPr>
-              <w:lastRenderedPageBreak/>
               <w:drawing>
                 <wp:anchor distT="0" distB="0" distL="114300" distR="114300" simplePos="0" relativeHeight="251954176" behindDoc="0" locked="0" layoutInCell="1" allowOverlap="1" wp14:anchorId="45035AFD" wp14:editId="0B76C2B3">
                   <wp:simplePos x="0" y="0"/>
@@ -2854,7 +2938,7 @@
                           <pic:cNvPicPr/>
                         </pic:nvPicPr>
                         <pic:blipFill>
-                          <a:blip r:embed="rId23"/>
+                          <a:blip r:embed="rId25"/>
                           <a:stretch>
                             <a:fillRect/>
                           </a:stretch>
@@ -2913,7 +2997,6 @@
                 <w:szCs w:val="24"/>
                 <w:lang w:val="en-NZ"/>
               </w:rPr>
-              <w:lastRenderedPageBreak/>
               <w:t>I used high colour contrast, appropriate headings and scalable text to make the interface easier to use with screen readers and magnification.</w:t>
             </w:r>
           </w:p>
@@ -2952,17 +3035,7 @@
                 <w:sz w:val="24"/>
                 <w:szCs w:val="24"/>
               </w:rPr>
-              <w:t xml:space="preserve">text resizer </w:t>
-            </w:r>
-            <w:r>
-              <w:rPr>
-                <w:b/>
-                <w:color w:val="171717" w:themeColor="background2" w:themeShade="1A"/>
-                <w:sz w:val="24"/>
-                <w:szCs w:val="24"/>
-              </w:rPr>
-              <w:lastRenderedPageBreak/>
-              <w:t>and accessibility menu in my work log on the 26</w:t>
+              <w:t>text resizer and accessibility menu in my work log on the 26</w:t>
             </w:r>
             <w:r>
               <w:rPr>
@@ -3004,7 +3077,6 @@
                 <w:noProof/>
                 <w:color w:val="171717" w:themeColor="background2" w:themeShade="1A"/>
               </w:rPr>
-              <w:lastRenderedPageBreak/>
               <w:drawing>
                 <wp:anchor distT="0" distB="0" distL="114300" distR="114300" simplePos="0" relativeHeight="251935744" behindDoc="0" locked="0" layoutInCell="1" allowOverlap="1" wp14:anchorId="57CDD39B" wp14:editId="4137AC21">
                   <wp:simplePos x="0" y="0"/>
@@ -3029,7 +3101,7 @@
                           <pic:cNvPicPr/>
                         </pic:nvPicPr>
                         <pic:blipFill>
-                          <a:blip r:embed="rId24"/>
+                          <a:blip r:embed="rId26"/>
                           <a:stretch>
                             <a:fillRect/>
                           </a:stretch>
@@ -3081,7 +3153,6 @@
                 <w:noProof/>
                 <w:color w:val="171717" w:themeColor="background2" w:themeShade="1A"/>
               </w:rPr>
-              <w:lastRenderedPageBreak/>
               <w:drawing>
                 <wp:anchor distT="0" distB="0" distL="114300" distR="114300" simplePos="0" relativeHeight="251952128" behindDoc="0" locked="0" layoutInCell="1" allowOverlap="1" wp14:anchorId="503EF54A" wp14:editId="24F0F829">
                   <wp:simplePos x="0" y="0"/>
@@ -3106,7 +3177,7 @@
                           <pic:cNvPicPr/>
                         </pic:nvPicPr>
                         <pic:blipFill>
-                          <a:blip r:embed="rId25"/>
+                          <a:blip r:embed="rId27"/>
                           <a:stretch>
                             <a:fillRect/>
                           </a:stretch>
@@ -3162,7 +3233,7 @@
                           <pic:cNvPicPr/>
                         </pic:nvPicPr>
                         <pic:blipFill>
-                          <a:blip r:embed="rId26"/>
+                          <a:blip r:embed="rId28"/>
                           <a:stretch>
                             <a:fillRect/>
                           </a:stretch>
@@ -3227,7 +3298,7 @@
                           <pic:cNvPicPr/>
                         </pic:nvPicPr>
                         <pic:blipFill>
-                          <a:blip r:embed="rId27"/>
+                          <a:blip r:embed="rId29"/>
                           <a:stretch>
                             <a:fillRect/>
                           </a:stretch>
@@ -3283,7 +3354,7 @@
                           <pic:cNvPicPr/>
                         </pic:nvPicPr>
                         <pic:blipFill>
-                          <a:blip r:embed="rId28"/>
+                          <a:blip r:embed="rId30"/>
                           <a:stretch>
                             <a:fillRect/>
                           </a:stretch>
@@ -3437,7 +3508,7 @@
                 <w:sz w:val="24"/>
                 <w:szCs w:val="24"/>
               </w:rPr>
-              <w:t xml:space="preserve">I also provide information about their data collection and say that </w:t>
+              <w:t xml:space="preserve">I also provide information about their data collection and say that they should not enter any personal data </w:t>
             </w:r>
             <w:r>
               <w:rPr>
@@ -3446,32 +3517,22 @@
                 <w:sz w:val="24"/>
                 <w:szCs w:val="24"/>
               </w:rPr>
-              <w:lastRenderedPageBreak/>
-              <w:t xml:space="preserve">they should not enter any personal data </w:t>
+              <w:t>they do not wish to share as this may be visible to other users using the same device.</w:t>
             </w:r>
-            <w:r>
+          </w:p>
+        </w:tc>
+        <w:tc>
+          <w:tcPr>
+            <w:tcW w:w="3487" w:type="dxa"/>
+          </w:tcPr>
+          <w:p>
+            <w:pPr>
               <w:rPr>
                 <w:b/>
                 <w:color w:val="171717" w:themeColor="background2" w:themeShade="1A"/>
                 <w:sz w:val="24"/>
                 <w:szCs w:val="24"/>
               </w:rPr>
-              <w:t>they do not wish to share as this may be visible to other users using the same device.</w:t>
-            </w:r>
-          </w:p>
-        </w:tc>
-        <w:tc>
-          <w:tcPr>
-            <w:tcW w:w="3487" w:type="dxa"/>
-          </w:tcPr>
-          <w:p>
-            <w:pPr>
-              <w:rPr>
-                <w:b/>
-                <w:color w:val="171717" w:themeColor="background2" w:themeShade="1A"/>
-                <w:sz w:val="24"/>
-                <w:szCs w:val="24"/>
-              </w:rPr>
             </w:pPr>
             <w:r>
               <w:rPr>
@@ -3479,7 +3540,6 @@
                 <w:noProof/>
                 <w:color w:val="171717" w:themeColor="background2" w:themeShade="1A"/>
               </w:rPr>
-              <w:lastRenderedPageBreak/>
               <w:drawing>
                 <wp:anchor distT="0" distB="0" distL="114300" distR="114300" simplePos="0" relativeHeight="251943936" behindDoc="0" locked="0" layoutInCell="1" allowOverlap="1" wp14:anchorId="0F071F14" wp14:editId="5AC7E7E4">
                   <wp:simplePos x="0" y="0"/>
@@ -3504,7 +3564,7 @@
                           <pic:cNvPicPr/>
                         </pic:nvPicPr>
                         <pic:blipFill>
-                          <a:blip r:embed="rId29"/>
+                          <a:blip r:embed="rId31"/>
                           <a:stretch>
                             <a:fillRect/>
                           </a:stretch>
@@ -3549,6 +3609,7 @@
               <w:rPr>
                 <w:sz w:val="20"/>
               </w:rPr>
+              <w:lastRenderedPageBreak/>
               <w:t>Aesthetics / functionality</w:t>
             </w:r>
           </w:p>
@@ -3648,7 +3709,7 @@
                           <pic:cNvPicPr/>
                         </pic:nvPicPr>
                         <pic:blipFill>
-                          <a:blip r:embed="rId30"/>
+                          <a:blip r:embed="rId32"/>
                           <a:stretch>
                             <a:fillRect/>
                           </a:stretch>
@@ -3704,7 +3765,7 @@
                           <pic:cNvPicPr/>
                         </pic:nvPicPr>
                         <pic:blipFill>
-                          <a:blip r:embed="rId31"/>
+                          <a:blip r:embed="rId33"/>
                           <a:stretch>
                             <a:fillRect/>
                           </a:stretch>
@@ -3760,7 +3821,7 @@
                           <pic:cNvPicPr/>
                         </pic:nvPicPr>
                         <pic:blipFill>
-                          <a:blip r:embed="rId32"/>
+                          <a:blip r:embed="rId34"/>
                           <a:stretch>
                             <a:fillRect/>
                           </a:stretch>
@@ -4496,7 +4557,6 @@
           <w:highlight w:val="yellow"/>
           <w:u w:val="single"/>
         </w:rPr>
-        <w:lastRenderedPageBreak/>
         <w:drawing>
           <wp:anchor distT="0" distB="0" distL="114300" distR="114300" simplePos="0" relativeHeight="251663360" behindDoc="0" locked="0" layoutInCell="1" allowOverlap="1" wp14:anchorId="6F1703F9" wp14:editId="3F7EA645">
             <wp:simplePos x="0" y="0"/>
@@ -4521,7 +4581,7 @@
                     <pic:cNvPicPr/>
                   </pic:nvPicPr>
                   <pic:blipFill>
-                    <a:blip r:embed="rId33"/>
+                    <a:blip r:embed="rId35"/>
                     <a:stretch>
                       <a:fillRect/>
                     </a:stretch>
@@ -4641,6 +4701,7 @@
     </w:p>
     <w:p>
       <w:r>
+        <w:lastRenderedPageBreak/>
         <w:t>My eye was attracted to the glowing button first on the landing page</w:t>
       </w:r>
       <w:r>
@@ -4823,7 +4884,6 @@
     </w:p>
     <w:p>
       <w:r>
-        <w:lastRenderedPageBreak/>
         <w:t>It’s</w:t>
       </w:r>
       <w:r>
@@ -4922,6 +4982,7 @@
           <w:highlight w:val="yellow"/>
           <w:u w:val="single"/>
         </w:rPr>
+        <w:lastRenderedPageBreak/>
         <w:t xml:space="preserve">My </w:t>
       </w:r>
       <w:proofErr w:type="spellStart"/>
@@ -5102,24 +5163,7 @@
         </w:rPr>
         <w:t xml:space="preserve"> - Aesthetic and features feedback:</w:t>
       </w:r>
-    </w:p>
-    <w:p>
-      <w:pPr>
-        <w:rPr>
-          <w:sz w:val="28"/>
-          <w:szCs w:val="28"/>
-        </w:rPr>
-      </w:pPr>
-      <w:r>
-        <w:rPr>
-          <w:sz w:val="28"/>
-          <w:szCs w:val="28"/>
-        </w:rPr>
-        <w:t>What my interface currently looks like:</w:t>
-      </w:r>
-    </w:p>
-    <w:p>
-      <w:pPr>
+      <w:r>
         <w:rPr>
           <w:b/>
           <w:bCs/>
@@ -5127,14 +5171,40 @@
           <w:szCs w:val="28"/>
           <w:u w:val="single"/>
         </w:rPr>
+        <w:t xml:space="preserve"> 1/08/26</w:t>
+      </w:r>
+    </w:p>
+    <w:p>
+      <w:pPr>
+        <w:rPr>
+          <w:sz w:val="28"/>
+          <w:szCs w:val="28"/>
+        </w:rPr>
+      </w:pPr>
+      <w:r>
+        <w:rPr>
+          <w:sz w:val="28"/>
+          <w:szCs w:val="28"/>
+        </w:rPr>
+        <w:t>What my interface currently looks like:</w:t>
+      </w:r>
+    </w:p>
+    <w:p>
+      <w:pPr>
+        <w:rPr>
+          <w:b/>
+          <w:bCs/>
+          <w:sz w:val="28"/>
+          <w:szCs w:val="28"/>
+          <w:u w:val="single"/>
+        </w:rPr>
       </w:pPr>
       <w:r>
         <w:rPr>
           <w:noProof/>
         </w:rPr>
-        <w:lastRenderedPageBreak/>
         <w:drawing>
-          <wp:anchor distT="0" distB="0" distL="114300" distR="114300" simplePos="0" relativeHeight="251674624" behindDoc="0" locked="0" layoutInCell="1" allowOverlap="1" wp14:anchorId="4DCB6E13" wp14:editId="28CC38CB">
+          <wp:anchor distT="0" distB="0" distL="114300" distR="114300" simplePos="0" relativeHeight="251674624" behindDoc="0" locked="0" layoutInCell="1" allowOverlap="1" wp14:anchorId="4DCB6E13" wp14:editId="7276A8C7">
             <wp:simplePos x="0" y="0"/>
             <wp:positionH relativeFrom="column">
               <wp:posOffset>2570773</wp:posOffset>
@@ -5157,7 +5227,7 @@
                     <pic:cNvPicPr/>
                   </pic:nvPicPr>
                   <pic:blipFill>
-                    <a:blip r:embed="rId34"/>
+                    <a:blip r:embed="rId36"/>
                     <a:stretch>
                       <a:fillRect/>
                     </a:stretch>
@@ -5212,7 +5282,7 @@
                     <pic:cNvPicPr/>
                   </pic:nvPicPr>
                   <pic:blipFill>
-                    <a:blip r:embed="rId35"/>
+                    <a:blip r:embed="rId37"/>
                     <a:stretch>
                       <a:fillRect/>
                     </a:stretch>
@@ -5271,7 +5341,7 @@
                     <pic:cNvPicPr/>
                   </pic:nvPicPr>
                   <pic:blipFill>
-                    <a:blip r:embed="rId36"/>
+                    <a:blip r:embed="rId38"/>
                     <a:stretch>
                       <a:fillRect/>
                     </a:stretch>
@@ -5345,6 +5415,7 @@
         <w:rPr>
           <w:noProof/>
         </w:rPr>
+        <w:lastRenderedPageBreak/>
         <w:drawing>
           <wp:anchor distT="0" distB="0" distL="114300" distR="114300" simplePos="0" relativeHeight="251678720" behindDoc="0" locked="0" layoutInCell="1" allowOverlap="1" wp14:anchorId="2CDD198F" wp14:editId="68D4B997">
             <wp:simplePos x="0" y="0"/>
@@ -5369,7 +5440,7 @@
                     <pic:cNvPicPr/>
                   </pic:nvPicPr>
                   <pic:blipFill>
-                    <a:blip r:embed="rId37"/>
+                    <a:blip r:embed="rId39"/>
                     <a:stretch>
                       <a:fillRect/>
                     </a:stretch>
@@ -5406,6 +5477,137 @@
       <w:r>
         <w:t xml:space="preserve">I think that you could do some error prevention because right now you can spam the keyboard and it accepts it. </w:t>
       </w:r>
+      <w:r>
+        <w:t xml:space="preserve">I also think the navigation bar looks clunky, and the add new thesis button is already above the navigation widgets. I think you should remove the log thesis button at the top. </w:t>
+      </w:r>
+    </w:p>
+    <w:p/>
+    <w:p>
+      <w:pPr>
+        <w:rPr>
+          <w:b/>
+          <w:bCs/>
+          <w:sz w:val="28"/>
+          <w:szCs w:val="28"/>
+          <w:u w:val="single"/>
+        </w:rPr>
+      </w:pPr>
+      <w:r>
+        <w:rPr>
+          <w:b/>
+          <w:bCs/>
+          <w:sz w:val="28"/>
+          <w:szCs w:val="28"/>
+          <w:highlight w:val="yellow"/>
+          <w:u w:val="single"/>
+        </w:rPr>
+        <w:t>Name: Nikhil</w:t>
+      </w:r>
+      <w:r>
+        <w:rPr>
+          <w:b/>
+          <w:bCs/>
+          <w:sz w:val="28"/>
+          <w:szCs w:val="28"/>
+          <w:u w:val="single"/>
+        </w:rPr>
+        <w:t xml:space="preserve"> </w:t>
+      </w:r>
+      <w:r>
+        <w:rPr>
+          <w:b/>
+          <w:bCs/>
+          <w:sz w:val="28"/>
+          <w:szCs w:val="28"/>
+          <w:u w:val="single"/>
+        </w:rPr>
+        <w:t xml:space="preserve"> - Aesthetic and features feedback: </w:t>
+      </w:r>
+      <w:r>
+        <w:rPr>
+          <w:b/>
+          <w:bCs/>
+          <w:sz w:val="28"/>
+          <w:szCs w:val="28"/>
+          <w:u w:val="single"/>
+        </w:rPr>
+        <w:t>31</w:t>
+      </w:r>
+      <w:r>
+        <w:rPr>
+          <w:b/>
+          <w:bCs/>
+          <w:sz w:val="28"/>
+          <w:szCs w:val="28"/>
+          <w:u w:val="single"/>
+        </w:rPr>
+        <w:t>/08/26</w:t>
+      </w:r>
+    </w:p>
+    <w:p>
+      <w:r>
+        <w:drawing>
+          <wp:anchor distT="0" distB="0" distL="114300" distR="114300" simplePos="0" relativeHeight="251972608" behindDoc="0" locked="0" layoutInCell="1" allowOverlap="1" wp14:anchorId="515DBC9B" wp14:editId="5FB03DAD">
+            <wp:simplePos x="0" y="0"/>
+            <wp:positionH relativeFrom="margin">
+              <wp:align>left</wp:align>
+            </wp:positionH>
+            <wp:positionV relativeFrom="paragraph">
+              <wp:posOffset>5519</wp:posOffset>
+            </wp:positionV>
+            <wp:extent cx="1242060" cy="1030605"/>
+            <wp:effectExtent l="0" t="0" r="0" b="0"/>
+            <wp:wrapSquare wrapText="bothSides"/>
+            <wp:docPr id="188621193" name="Picture 1"/>
+            <wp:cNvGraphicFramePr>
+              <a:graphicFrameLocks xmlns:a="http://schemas.openxmlformats.org/drawingml/2006/main" noChangeAspect="1"/>
+            </wp:cNvGraphicFramePr>
+            <a:graphic xmlns:a="http://schemas.openxmlformats.org/drawingml/2006/main">
+              <a:graphicData uri="http://schemas.openxmlformats.org/drawingml/2006/picture">
+                <pic:pic xmlns:pic="http://schemas.openxmlformats.org/drawingml/2006/picture">
+                  <pic:nvPicPr>
+                    <pic:cNvPr id="188621193" name=""/>
+                    <pic:cNvPicPr/>
+                  </pic:nvPicPr>
+                  <pic:blipFill>
+                    <a:blip r:embed="rId40"/>
+                    <a:stretch>
+                      <a:fillRect/>
+                    </a:stretch>
+                  </pic:blipFill>
+                  <pic:spPr>
+                    <a:xfrm>
+                      <a:off x="0" y="0"/>
+                      <a:ext cx="1242060" cy="1030605"/>
+                    </a:xfrm>
+                    <a:prstGeom prst="rect">
+                      <a:avLst/>
+                    </a:prstGeom>
+                  </pic:spPr>
+                </pic:pic>
+              </a:graphicData>
+            </a:graphic>
+            <wp14:sizeRelH relativeFrom="margin">
+              <wp14:pctWidth>0</wp14:pctWidth>
+            </wp14:sizeRelH>
+            <wp14:sizeRelV relativeFrom="margin">
+              <wp14:pctHeight>0</wp14:pctHeight>
+            </wp14:sizeRelV>
+          </wp:anchor>
+        </w:drawing>
+      </w:r>
+      <w:r>
+        <w:t>I think that</w:t>
+      </w:r>
+      <w:r>
+        <w:t xml:space="preserve"> the contrast between the disclaimer background and the text is too little. Its black and grey. It is important to have high </w:t>
+      </w:r>
+      <w:r>
+        <w:t xml:space="preserve">contrast on the disclaimer because </w:t>
+      </w:r>
+      <w:r>
+        <w:t>is an important message about privacy, so legibility matters.</w:t>
+      </w:r>
     </w:p>
     <w:p/>
     <w:p/>
@@ -5413,18 +5615,13 @@
     <w:p/>
     <w:p/>
     <w:p/>
-    <w:p>
-      <w:r>
-        <w:t xml:space="preserve">I also think the navigation bar looks clunky, and the add new thesis button is already above the navigation widgets. I think you should remove the log thesis button at the top. </w:t>
-      </w:r>
-    </w:p>
+    <w:p/>
     <w:p>
       <w:r>
         <w:rPr>
           <w:noProof/>
           <w:u w:val="single"/>
         </w:rPr>
-        <w:lastRenderedPageBreak/>
         <w:drawing>
           <wp:anchor distT="0" distB="0" distL="114300" distR="114300" simplePos="0" relativeHeight="251696128" behindDoc="0" locked="0" layoutInCell="1" allowOverlap="1" wp14:anchorId="317FC2E7" wp14:editId="004DE928">
             <wp:simplePos x="0" y="0"/>
@@ -5449,7 +5646,7 @@
                     <pic:cNvPicPr/>
                   </pic:nvPicPr>
                   <pic:blipFill>
-                    <a:blip r:embed="rId38"/>
+                    <a:blip r:embed="rId41"/>
                     <a:stretch>
                       <a:fillRect/>
                     </a:stretch>
@@ -5550,7 +5747,7 @@
                     <pic:cNvPicPr/>
                   </pic:nvPicPr>
                   <pic:blipFill>
-                    <a:blip r:embed="rId39"/>
+                    <a:blip r:embed="rId42"/>
                     <a:stretch>
                       <a:fillRect/>
                     </a:stretch>
@@ -5613,6 +5810,7 @@
         <w:rPr>
           <w:noProof/>
         </w:rPr>
+        <w:lastRenderedPageBreak/>
         <w:drawing>
           <wp:anchor distT="0" distB="0" distL="114300" distR="114300" simplePos="0" relativeHeight="251956224" behindDoc="0" locked="0" layoutInCell="1" allowOverlap="1" wp14:anchorId="26C49830" wp14:editId="1391CC2F">
             <wp:simplePos x="0" y="0"/>
@@ -5637,7 +5835,7 @@
                     <pic:cNvPicPr/>
                   </pic:nvPicPr>
                   <pic:blipFill>
-                    <a:blip r:embed="rId40"/>
+                    <a:blip r:embed="rId43"/>
                     <a:stretch>
                       <a:fillRect/>
                     </a:stretch>
@@ -5678,97 +5876,106 @@
     </w:p>
     <w:p>
       <w:pPr>
-        <w:rPr>
-          <w:b/>
-          <w:bCs/>
-          <w:u w:val="single"/>
-        </w:rPr>
-      </w:pPr>
-    </w:p>
-    <w:p/>
-    <w:p>
-      <w:pPr>
-        <w:pStyle w:val="ListParagraph"/>
-        <w:rPr>
-          <w:u w:val="single"/>
-        </w:rPr>
-      </w:pPr>
-    </w:p>
-    <w:p>
-      <w:pPr>
-        <w:pStyle w:val="ListParagraph"/>
-        <w:rPr>
-          <w:u w:val="single"/>
-        </w:rPr>
-      </w:pPr>
-    </w:p>
-    <w:p>
-      <w:pPr>
-        <w:pStyle w:val="ListParagraph"/>
-        <w:rPr>
-          <w:u w:val="single"/>
-        </w:rPr>
-      </w:pPr>
-    </w:p>
-    <w:p>
-      <w:pPr>
-        <w:pStyle w:val="ListParagraph"/>
-        <w:rPr>
-          <w:u w:val="single"/>
-        </w:rPr>
-      </w:pPr>
-    </w:p>
-    <w:p>
-      <w:pPr>
-        <w:pStyle w:val="ListParagraph"/>
-        <w:rPr>
-          <w:u w:val="single"/>
-        </w:rPr>
-      </w:pPr>
-    </w:p>
-    <w:p>
-      <w:pPr>
-        <w:pStyle w:val="ListParagraph"/>
-        <w:rPr>
-          <w:u w:val="single"/>
-        </w:rPr>
-      </w:pPr>
-    </w:p>
-    <w:p>
-      <w:pPr>
-        <w:pStyle w:val="ListParagraph"/>
-        <w:rPr>
-          <w:u w:val="single"/>
-        </w:rPr>
-      </w:pPr>
-    </w:p>
-    <w:p>
-      <w:pPr>
-        <w:rPr>
-          <w:b/>
-          <w:bCs/>
-          <w:u w:val="single"/>
-        </w:rPr>
-      </w:pPr>
-      <w:r>
-        <w:rPr>
-          <w:b/>
-          <w:bCs/>
-          <w:highlight w:val="yellow"/>
-          <w:u w:val="single"/>
-        </w:rPr>
-        <w:t>Two methods of project management for planning:</w:t>
-      </w:r>
-    </w:p>
-    <w:p>
-      <w:pPr>
         <w:pStyle w:val="ListParagraph"/>
         <w:numPr>
           <w:ilvl w:val="0"/>
           <w:numId w:val="2"/>
         </w:numPr>
       </w:pPr>
-      <w:hyperlink r:id="rId41" w:history="1">
+      <w:r>
+        <w:t>Tested for contrast on my disclaimer between the &lt;p&gt; text and the background. Updated it to be higher contrast by changing the grey to the off-white colour present throughout my interface.</w:t>
+      </w:r>
+    </w:p>
+    <w:p>
+      <w:pPr>
+        <w:pStyle w:val="ListParagraph"/>
+        <w:rPr>
+          <w:u w:val="single"/>
+        </w:rPr>
+      </w:pPr>
+    </w:p>
+    <w:p>
+      <w:pPr>
+        <w:pStyle w:val="ListParagraph"/>
+        <w:rPr>
+          <w:u w:val="single"/>
+        </w:rPr>
+      </w:pPr>
+    </w:p>
+    <w:p>
+      <w:pPr>
+        <w:pStyle w:val="ListParagraph"/>
+        <w:rPr>
+          <w:u w:val="single"/>
+        </w:rPr>
+      </w:pPr>
+    </w:p>
+    <w:p>
+      <w:pPr>
+        <w:pStyle w:val="ListParagraph"/>
+        <w:rPr>
+          <w:u w:val="single"/>
+        </w:rPr>
+      </w:pPr>
+    </w:p>
+    <w:p>
+      <w:pPr>
+        <w:rPr>
+          <w:u w:val="single"/>
+        </w:rPr>
+      </w:pPr>
+    </w:p>
+    <w:p>
+      <w:pPr>
+        <w:pStyle w:val="ListParagraph"/>
+        <w:rPr>
+          <w:u w:val="single"/>
+        </w:rPr>
+      </w:pPr>
+    </w:p>
+    <w:p>
+      <w:pPr>
+        <w:pStyle w:val="ListParagraph"/>
+        <w:rPr>
+          <w:u w:val="single"/>
+        </w:rPr>
+      </w:pPr>
+    </w:p>
+    <w:p>
+      <w:pPr>
+        <w:pStyle w:val="ListParagraph"/>
+        <w:rPr>
+          <w:u w:val="single"/>
+        </w:rPr>
+      </w:pPr>
+    </w:p>
+    <w:p>
+      <w:pPr>
+        <w:rPr>
+          <w:b/>
+          <w:bCs/>
+          <w:u w:val="single"/>
+        </w:rPr>
+      </w:pPr>
+      <w:r>
+        <w:rPr>
+          <w:b/>
+          <w:bCs/>
+          <w:highlight w:val="yellow"/>
+          <w:u w:val="single"/>
+        </w:rPr>
+        <w:t>Two methods of project management for planning:</w:t>
+      </w:r>
+    </w:p>
+    <w:p>
+      <w:pPr>
+        <w:pStyle w:val="ListParagraph"/>
+        <w:numPr>
+          <w:ilvl w:val="0"/>
+          <w:numId w:val="2"/>
+        </w:numPr>
+      </w:pPr>
+      <w:hyperlink r:id="rId44" w:history="1">
         <w:r>
           <w:rPr>
             <w:rStyle w:val="Hyperlink"/>
@@ -5785,7 +5992,7 @@
           <w:numId w:val="2"/>
         </w:numPr>
       </w:pPr>
-      <w:hyperlink r:id="rId42" w:history="1">
+      <w:hyperlink r:id="rId45" w:history="1">
         <w:r>
           <w:rPr>
             <w:rStyle w:val="Hyperlink"/>
@@ -5816,7 +6023,7 @@
       <w:r>
         <w:t xml:space="preserve"> repository </w:t>
       </w:r>
-      <w:hyperlink r:id="rId43" w:history="1">
+      <w:hyperlink r:id="rId46" w:history="1">
         <w:r>
           <w:rPr>
             <w:rStyle w:val="Hyperlink"/>
@@ -5849,7 +6056,7 @@
                     <pic:cNvPicPr/>
                   </pic:nvPicPr>
                   <pic:blipFill>
-                    <a:blip r:embed="rId44" cstate="print">
+                    <a:blip r:embed="rId47" cstate="print">
                       <a:extLst>
                         <a:ext uri="{28A0092B-C50C-407E-A947-70E740481C1C}">
                           <a14:useLocalDpi xmlns:a14="http://schemas.microsoft.com/office/drawing/2010/main" val="0"/>
@@ -5895,7 +6102,7 @@
                     <pic:cNvPicPr/>
                   </pic:nvPicPr>
                   <pic:blipFill>
-                    <a:blip r:embed="rId45" cstate="print">
+                    <a:blip r:embed="rId48" cstate="print">
                       <a:extLst>
                         <a:ext uri="{28A0092B-C50C-407E-A947-70E740481C1C}">
                           <a14:useLocalDpi xmlns:a14="http://schemas.microsoft.com/office/drawing/2010/main" val="0"/>
@@ -5941,7 +6148,7 @@
                     <pic:cNvPicPr/>
                   </pic:nvPicPr>
                   <pic:blipFill>
-                    <a:blip r:embed="rId46" cstate="print">
+                    <a:blip r:embed="rId49" cstate="print">
                       <a:extLst>
                         <a:ext uri="{28A0092B-C50C-407E-A947-70E740481C1C}">
                           <a14:useLocalDpi xmlns:a14="http://schemas.microsoft.com/office/drawing/2010/main" val="0"/>
@@ -6000,7 +6207,6 @@
         </w:numPr>
       </w:pPr>
       <w:r>
-        <w:lastRenderedPageBreak/>
         <w:t>Ability to input stock holdings by value and share size</w:t>
       </w:r>
     </w:p>
@@ -8276,7 +8482,7 @@
   <w:style w:type="paragraph" w:default="1" w:styleId="Normal">
     <w:name w:val="Normal"/>
     <w:qFormat/>
-    <w:rsid w:val="00F228A7"/>
+    <w:rsid w:val="006E53EE"/>
   </w:style>
   <w:style w:type="paragraph" w:styleId="Heading1">
     <w:name w:val="heading 1"/>

</xml_diff>